<commit_message>
Add some into the note
</commit_message>
<xml_diff>
--- a/docs/08-final/poyasnitelnaya_zapiska.docx
+++ b/docs/08-final/poyasnitelnaya_zapiska.docx
@@ -2829,16 +2829,38 @@
           <w:szCs w:val="24"/>
           <w:lang w:val="ru-RU" w:eastAsia="ru-RU"/>
         </w:rPr>
-        <w:t xml:space="preserve">3. Задачи: </w:t>
-      </w:r>
-      <w:r>
-        <w:rPr>
-          <w:rFonts w:eastAsia="Times New Roman" w:cs="Times New Roman"/>
+        <w:t>3. Задачи</w:t>
+      </w:r>
+      <w:proofErr w:type="gramStart"/>
+      <w:r>
+        <w:rPr>
+          <w:rFonts w:eastAsia="Times New Roman" w:cs="Times New Roman"/>
+          <w:b/>
+          <w:bCs/>
           <w:sz w:val="24"/>
           <w:szCs w:val="24"/>
           <w:lang w:val="ru-RU" w:eastAsia="ru-RU"/>
         </w:rPr>
-        <w:t xml:space="preserve">Разработать программное обеспечение и решать практические задачи в области создания </w:t>
+        <w:t xml:space="preserve">: </w:t>
+      </w:r>
+      <w:r>
+        <w:rPr>
+          <w:rFonts w:eastAsia="Times New Roman" w:cs="Times New Roman"/>
+          <w:sz w:val="24"/>
+          <w:szCs w:val="24"/>
+          <w:lang w:val="ru-RU" w:eastAsia="ru-RU"/>
+        </w:rPr>
+        <w:t>Разработать</w:t>
+      </w:r>
+      <w:proofErr w:type="gramEnd"/>
+      <w:r>
+        <w:rPr>
+          <w:rFonts w:eastAsia="Times New Roman" w:cs="Times New Roman"/>
+          <w:sz w:val="24"/>
+          <w:szCs w:val="24"/>
+          <w:lang w:val="ru-RU" w:eastAsia="ru-RU"/>
+        </w:rPr>
+        <w:t xml:space="preserve"> программное обеспечение и решать практические задачи в области создания </w:t>
       </w:r>
       <w:r>
         <w:rPr>
@@ -3497,7 +3519,25 @@
           <w:szCs w:val="24"/>
           <w:lang w:val="ru-RU" w:eastAsia="ru-RU"/>
         </w:rPr>
-        <w:t xml:space="preserve"> — </w:t>
+        <w:t xml:space="preserve"> </w:t>
+      </w:r>
+      <w:r>
+        <w:rPr>
+          <w:rFonts w:eastAsia="Times New Roman" w:cs="Times New Roman"/>
+          <w:sz w:val="24"/>
+          <w:szCs w:val="24"/>
+          <w:lang w:val="ru-RU" w:eastAsia="ru-RU"/>
+        </w:rPr>
+        <w:t>-</w:t>
+      </w:r>
+      <w:r>
+        <w:rPr>
+          <w:rFonts w:eastAsia="Times New Roman" w:cs="Times New Roman"/>
+          <w:sz w:val="24"/>
+          <w:szCs w:val="24"/>
+          <w:lang w:val="ru-RU" w:eastAsia="ru-RU"/>
+        </w:rPr>
+        <w:t xml:space="preserve"> </w:t>
       </w:r>
       <w:r>
         <w:rPr>
@@ -3557,7 +3597,79 @@
           <w:szCs w:val="24"/>
           <w:lang w:val="ru-RU" w:eastAsia="ru-RU"/>
         </w:rPr>
-        <w:t>25 % — теоретическая часть; 50 % — проектная часть; 75 % — практическая часть; 100 % — оформление пояснительной записки.</w:t>
+        <w:t xml:space="preserve">25 % </w:t>
+      </w:r>
+      <w:r>
+        <w:rPr>
+          <w:rFonts w:eastAsia="Times New Roman" w:cs="Times New Roman"/>
+          <w:sz w:val="24"/>
+          <w:szCs w:val="24"/>
+          <w:lang w:val="ru-RU" w:eastAsia="ru-RU"/>
+        </w:rPr>
+        <w:t>-</w:t>
+      </w:r>
+      <w:r>
+        <w:rPr>
+          <w:rFonts w:eastAsia="Times New Roman" w:cs="Times New Roman"/>
+          <w:sz w:val="24"/>
+          <w:szCs w:val="24"/>
+          <w:lang w:val="ru-RU" w:eastAsia="ru-RU"/>
+        </w:rPr>
+        <w:t xml:space="preserve"> теоретическая часть; 50 % </w:t>
+      </w:r>
+      <w:r>
+        <w:rPr>
+          <w:rFonts w:eastAsia="Times New Roman" w:cs="Times New Roman"/>
+          <w:sz w:val="24"/>
+          <w:szCs w:val="24"/>
+          <w:lang w:val="ru-RU" w:eastAsia="ru-RU"/>
+        </w:rPr>
+        <w:t>-</w:t>
+      </w:r>
+      <w:r>
+        <w:rPr>
+          <w:rFonts w:eastAsia="Times New Roman" w:cs="Times New Roman"/>
+          <w:sz w:val="24"/>
+          <w:szCs w:val="24"/>
+          <w:lang w:val="ru-RU" w:eastAsia="ru-RU"/>
+        </w:rPr>
+        <w:t xml:space="preserve"> проектная часть; 75 % </w:t>
+      </w:r>
+      <w:r>
+        <w:rPr>
+          <w:rFonts w:eastAsia="Times New Roman" w:cs="Times New Roman"/>
+          <w:sz w:val="24"/>
+          <w:szCs w:val="24"/>
+          <w:lang w:val="ru-RU" w:eastAsia="ru-RU"/>
+        </w:rPr>
+        <w:t>-</w:t>
+      </w:r>
+      <w:r>
+        <w:rPr>
+          <w:rFonts w:eastAsia="Times New Roman" w:cs="Times New Roman"/>
+          <w:sz w:val="24"/>
+          <w:szCs w:val="24"/>
+          <w:lang w:val="ru-RU" w:eastAsia="ru-RU"/>
+        </w:rPr>
+        <w:t xml:space="preserve"> практическая часть; 100 % </w:t>
+      </w:r>
+      <w:r>
+        <w:rPr>
+          <w:rFonts w:eastAsia="Times New Roman" w:cs="Times New Roman"/>
+          <w:sz w:val="24"/>
+          <w:szCs w:val="24"/>
+          <w:lang w:val="ru-RU" w:eastAsia="ru-RU"/>
+        </w:rPr>
+        <w:t>-</w:t>
+      </w:r>
+      <w:r>
+        <w:rPr>
+          <w:rFonts w:eastAsia="Times New Roman" w:cs="Times New Roman"/>
+          <w:sz w:val="24"/>
+          <w:szCs w:val="24"/>
+          <w:lang w:val="ru-RU" w:eastAsia="ru-RU"/>
+        </w:rPr>
+        <w:t xml:space="preserve"> оформление пояснительной записки.</w:t>
       </w:r>
     </w:p>
     <w:p>
@@ -3584,7 +3696,23 @@
           <w:sz w:val="24"/>
           <w:lang w:val="ru-RU"/>
         </w:rPr>
-        <w:t>«30»  мая  2026 г.</w:t>
+        <w:t>«</w:t>
+      </w:r>
+      <w:proofErr w:type="gramStart"/>
+      <w:r>
+        <w:rPr>
+          <w:sz w:val="24"/>
+          <w:lang w:val="ru-RU"/>
+        </w:rPr>
+        <w:t>30»  мая</w:t>
+      </w:r>
+      <w:proofErr w:type="gramEnd"/>
+      <w:r>
+        <w:rPr>
+          <w:sz w:val="24"/>
+          <w:lang w:val="ru-RU"/>
+        </w:rPr>
+        <w:t xml:space="preserve">  2026 г.</w:t>
       </w:r>
     </w:p>
     <w:p>
@@ -21132,6 +21260,7 @@
         </w:rPr>
         <w:t xml:space="preserve">. Конфигурация приложения и внешних параметров хранится в </w:t>
       </w:r>
+      <w:proofErr w:type="gramStart"/>
       <w:r>
         <w:rPr>
           <w:rFonts w:eastAsia="Times New Roman"/>
@@ -21153,6 +21282,7 @@
         <w:t>yaml</w:t>
       </w:r>
       <w:proofErr w:type="spellEnd"/>
+      <w:proofErr w:type="gramEnd"/>
       <w:r>
         <w:rPr>
           <w:rFonts w:eastAsia="Times New Roman"/>
@@ -23067,6 +23197,7 @@
         </w:rPr>
         <w:t xml:space="preserve"> и </w:t>
       </w:r>
+      <w:proofErr w:type="gramStart"/>
       <w:r>
         <w:rPr>
           <w:rFonts w:eastAsia="Times New Roman"/>
@@ -23088,6 +23219,7 @@
         <w:t>json</w:t>
       </w:r>
       <w:proofErr w:type="spellEnd"/>
+      <w:proofErr w:type="gramEnd"/>
       <w:r>
         <w:rPr>
           <w:rFonts w:eastAsia="Times New Roman"/>
@@ -30834,6 +30966,7 @@
         <w:t xml:space="preserve"> Gradle-</w:t>
       </w:r>
       <w:proofErr w:type="spellStart"/>
+      <w:proofErr w:type="gramStart"/>
       <w:r>
         <w:rPr>
           <w:rFonts w:eastAsia="Times New Roman"/>
@@ -30852,9 +30985,24 @@
         <w:rPr>
           <w:rFonts w:eastAsia="Times New Roman"/>
         </w:rPr>
-        <w:t>apps:backend:bootRun</w:t>
+        <w:t>apps</w:t>
+      </w:r>
+      <w:proofErr w:type="gramEnd"/>
+      <w:r>
+        <w:rPr>
+          <w:rFonts w:eastAsia="Times New Roman"/>
+        </w:rPr>
+        <w:t>:</w:t>
+      </w:r>
+      <w:proofErr w:type="gramStart"/>
+      <w:r>
+        <w:rPr>
+          <w:rFonts w:eastAsia="Times New Roman"/>
+        </w:rPr>
+        <w:t>backend:bootRun</w:t>
       </w:r>
       <w:proofErr w:type="spellEnd"/>
+      <w:proofErr w:type="gramEnd"/>
       <w:r>
         <w:rPr>
           <w:rFonts w:eastAsia="Times New Roman"/>
@@ -31551,7 +31699,15 @@
           <w:rFonts w:eastAsia="Times New Roman"/>
           <w:lang w:val="ru-RU"/>
         </w:rPr>
-        <w:t>-клиент запускается из корня репозитория задачей :</w:t>
+        <w:t xml:space="preserve">-клиент запускается из корня репозитория </w:t>
+      </w:r>
+      <w:proofErr w:type="gramStart"/>
+      <w:r>
+        <w:rPr>
+          <w:rFonts w:eastAsia="Times New Roman"/>
+          <w:lang w:val="ru-RU"/>
+        </w:rPr>
+        <w:t>задачей :</w:t>
       </w:r>
       <w:r>
         <w:rPr>
@@ -31559,6 +31715,7 @@
         </w:rPr>
         <w:t>apps</w:t>
       </w:r>
+      <w:proofErr w:type="gramEnd"/>
       <w:r>
         <w:rPr>
           <w:rFonts w:eastAsia="Times New Roman"/>
@@ -31566,6 +31723,7 @@
         </w:rPr>
         <w:t>:</w:t>
       </w:r>
+      <w:proofErr w:type="gramStart"/>
       <w:r>
         <w:rPr>
           <w:rFonts w:eastAsia="Times New Roman"/>
@@ -31585,6 +31743,7 @@
         </w:rPr>
         <w:t>run</w:t>
       </w:r>
+      <w:proofErr w:type="gramEnd"/>
       <w:r>
         <w:rPr>
           <w:rFonts w:eastAsia="Times New Roman"/>
@@ -31631,7 +31790,15 @@
           <w:rFonts w:eastAsia="Times New Roman"/>
           <w:lang w:val="ru-RU"/>
         </w:rPr>
-        <w:t>Для создания автономного пакета выполняется задача :</w:t>
+        <w:t xml:space="preserve">Для создания автономного пакета выполняется </w:t>
+      </w:r>
+      <w:proofErr w:type="gramStart"/>
+      <w:r>
+        <w:rPr>
+          <w:rFonts w:eastAsia="Times New Roman"/>
+          <w:lang w:val="ru-RU"/>
+        </w:rPr>
+        <w:t>задача :</w:t>
       </w:r>
       <w:r>
         <w:rPr>
@@ -31639,6 +31806,7 @@
         </w:rPr>
         <w:t>apps</w:t>
       </w:r>
+      <w:proofErr w:type="gramEnd"/>
       <w:r>
         <w:rPr>
           <w:rFonts w:eastAsia="Times New Roman"/>
@@ -31646,6 +31814,7 @@
         </w:rPr>
         <w:t>:</w:t>
       </w:r>
+      <w:proofErr w:type="gramStart"/>
       <w:r>
         <w:rPr>
           <w:rFonts w:eastAsia="Times New Roman"/>
@@ -31667,6 +31836,7 @@
         <w:t>packageDesktopAppImage</w:t>
       </w:r>
       <w:proofErr w:type="spellEnd"/>
+      <w:proofErr w:type="gramEnd"/>
       <w:r>
         <w:rPr>
           <w:rFonts w:eastAsia="Times New Roman"/>
@@ -31823,6 +31993,7 @@
           <w:lang w:val="ru-RU"/>
         </w:rPr>
       </w:pPr>
+      <w:proofErr w:type="gramStart"/>
       <w:r>
         <w:rPr>
           <w:rFonts w:eastAsia="Times New Roman"/>
@@ -31837,6 +32008,7 @@
         </w:rPr>
         <w:t>apps</w:t>
       </w:r>
+      <w:proofErr w:type="gramEnd"/>
       <w:r>
         <w:rPr>
           <w:rFonts w:eastAsia="Times New Roman"/>
@@ -31844,6 +32016,7 @@
         </w:rPr>
         <w:t>:</w:t>
       </w:r>
+      <w:proofErr w:type="gramStart"/>
       <w:r>
         <w:rPr>
           <w:rFonts w:eastAsia="Times New Roman"/>
@@ -31865,6 +32038,7 @@
         <w:t>packageDesktopInstaller</w:t>
       </w:r>
       <w:proofErr w:type="spellEnd"/>
+      <w:proofErr w:type="gramEnd"/>
       <w:r>
         <w:rPr>
           <w:rFonts w:eastAsia="Times New Roman"/>
@@ -36984,7 +37158,21 @@
           <w:szCs w:val="28"/>
         </w:rPr>
         <w:lastRenderedPageBreak/>
-        <w:t>человеко-месяцев, а календарная продолжительность разработки — около 11 месяцев.</w:t>
+        <w:t xml:space="preserve">человеко-месяцев, а календарная продолжительность разработки </w:t>
+      </w:r>
+      <w:r>
+        <w:rPr>
+          <w:sz w:val="28"/>
+          <w:szCs w:val="28"/>
+        </w:rPr>
+        <w:t>-</w:t>
+      </w:r>
+      <w:r>
+        <w:rPr>
+          <w:sz w:val="28"/>
+          <w:szCs w:val="28"/>
+        </w:rPr>
+        <w:t xml:space="preserve"> около 11 месяцев.</w:t>
       </w:r>
     </w:p>
     <w:p>
@@ -39520,985 +39708,1718 @@
     </w:p>
     <w:p>
       <w:pPr>
+        <w:pStyle w:val="a7"/>
+        <w:numPr>
+          <w:ilvl w:val="0"/>
+          <w:numId w:val="7"/>
+        </w:numPr>
+        <w:tabs>
+          <w:tab w:val="left" w:pos="993"/>
+        </w:tabs>
         <w:spacing w:after="0"/>
-        <w:rPr>
-          <w:lang w:val="ru-RU"/>
+        <w:ind w:left="0" w:firstLine="709"/>
+        <w:rPr>
+          <w:rFonts w:eastAsia="Times New Roman" w:cs="Times New Roman"/>
+          <w:szCs w:val="28"/>
+          <w:lang w:eastAsia="ru-RU"/>
         </w:rPr>
       </w:pPr>
-      <w:r>
-        <w:rPr>
-          <w:rFonts w:eastAsia="Times New Roman"/>
-          <w:lang w:val="ru-RU"/>
-        </w:rPr>
-        <w:t xml:space="preserve">1. </w:t>
-      </w:r>
-      <w:proofErr w:type="spellStart"/>
-      <w:r>
-        <w:rPr>
-          <w:rFonts w:eastAsia="Times New Roman"/>
-          <w:lang w:val="ru-RU"/>
-        </w:rPr>
-        <w:t>Соммервилл</w:t>
-      </w:r>
-      <w:proofErr w:type="spellEnd"/>
-      <w:r>
-        <w:rPr>
-          <w:rFonts w:eastAsia="Times New Roman"/>
-          <w:lang w:val="ru-RU"/>
-        </w:rPr>
-        <w:t xml:space="preserve"> И. Инженерия программного обеспечения. 10-е изд. </w:t>
-      </w:r>
-      <w:r>
-        <w:rPr>
-          <w:rFonts w:eastAsia="Times New Roman"/>
-          <w:lang w:val="ru-RU"/>
+      <w:bookmarkStart w:id="41" w:name="_Toc233035891"/>
+      <w:r>
+        <w:rPr>
+          <w:rFonts w:eastAsia="Times New Roman" w:cs="Times New Roman"/>
+          <w:szCs w:val="28"/>
+          <w:lang w:eastAsia="ru-RU"/>
+        </w:rPr>
+        <w:t xml:space="preserve">Sommerville I. Software Engineering. 10th ed. </w:t>
+      </w:r>
+      <w:r>
+        <w:rPr>
+          <w:rFonts w:eastAsia="Times New Roman" w:cs="Times New Roman"/>
+          <w:szCs w:val="28"/>
+          <w:lang w:eastAsia="ru-RU"/>
         </w:rPr>
         <w:t>-</w:t>
       </w:r>
       <w:r>
         <w:rPr>
-          <w:rFonts w:eastAsia="Times New Roman"/>
-          <w:lang w:val="ru-RU"/>
-        </w:rPr>
-        <w:t xml:space="preserve"> М.: Вильямс, 2018.</w:t>
+          <w:rFonts w:eastAsia="Times New Roman" w:cs="Times New Roman"/>
+          <w:szCs w:val="28"/>
+          <w:lang w:eastAsia="ru-RU"/>
+        </w:rPr>
+        <w:t xml:space="preserve"> Pearson, 2016.</w:t>
       </w:r>
     </w:p>
     <w:p>
       <w:pPr>
+        <w:pStyle w:val="a7"/>
+        <w:numPr>
+          <w:ilvl w:val="0"/>
+          <w:numId w:val="7"/>
+        </w:numPr>
+        <w:tabs>
+          <w:tab w:val="left" w:pos="993"/>
+        </w:tabs>
         <w:spacing w:after="0"/>
-        <w:rPr>
-          <w:lang w:val="ru-RU"/>
+        <w:ind w:left="0" w:firstLine="709"/>
+        <w:rPr>
+          <w:rFonts w:eastAsia="Times New Roman" w:cs="Times New Roman"/>
+          <w:szCs w:val="28"/>
+          <w:lang w:val="ru-RU" w:eastAsia="ru-RU"/>
         </w:rPr>
       </w:pPr>
       <w:r>
         <w:rPr>
-          <w:rFonts w:eastAsia="Times New Roman"/>
-          <w:lang w:val="ru-RU"/>
-        </w:rPr>
-        <w:t xml:space="preserve">2. Мартин Р. Чистая архитектура. Искусство разработки программного обеспечения. </w:t>
-      </w:r>
-      <w:r>
-        <w:rPr>
-          <w:rFonts w:eastAsia="Times New Roman"/>
-          <w:lang w:val="ru-RU"/>
+          <w:rFonts w:eastAsia="Times New Roman" w:cs="Times New Roman"/>
+          <w:szCs w:val="28"/>
+          <w:lang w:val="ru-RU" w:eastAsia="ru-RU"/>
+        </w:rPr>
+        <w:t xml:space="preserve">Мартин Р. Чистая архитектура. Искусство разработки программного обеспечения. </w:t>
+      </w:r>
+      <w:r>
+        <w:rPr>
+          <w:rFonts w:eastAsia="Times New Roman" w:cs="Times New Roman"/>
+          <w:szCs w:val="28"/>
+          <w:lang w:val="ru-RU" w:eastAsia="ru-RU"/>
         </w:rPr>
         <w:t>-</w:t>
       </w:r>
       <w:r>
         <w:rPr>
-          <w:rFonts w:eastAsia="Times New Roman"/>
-          <w:lang w:val="ru-RU"/>
-        </w:rPr>
-        <w:t xml:space="preserve"> СПб.: Питер, 2018.</w:t>
+          <w:rFonts w:eastAsia="Times New Roman" w:cs="Times New Roman"/>
+          <w:szCs w:val="28"/>
+          <w:lang w:val="ru-RU" w:eastAsia="ru-RU"/>
+        </w:rPr>
+        <w:t xml:space="preserve"> СПб.: Питер, 2018. </w:t>
+      </w:r>
+      <w:r>
+        <w:rPr>
+          <w:rFonts w:eastAsia="Times New Roman" w:cs="Times New Roman"/>
+          <w:szCs w:val="28"/>
+          <w:lang w:val="ru-RU" w:eastAsia="ru-RU"/>
+        </w:rPr>
+        <w:t>-</w:t>
+      </w:r>
+      <w:r>
+        <w:rPr>
+          <w:rFonts w:eastAsia="Times New Roman" w:cs="Times New Roman"/>
+          <w:szCs w:val="28"/>
+          <w:lang w:val="ru-RU" w:eastAsia="ru-RU"/>
+        </w:rPr>
+        <w:t xml:space="preserve"> 352 с.</w:t>
       </w:r>
     </w:p>
     <w:p>
       <w:pPr>
+        <w:pStyle w:val="a7"/>
+        <w:numPr>
+          <w:ilvl w:val="0"/>
+          <w:numId w:val="7"/>
+        </w:numPr>
+        <w:tabs>
+          <w:tab w:val="left" w:pos="993"/>
+        </w:tabs>
         <w:spacing w:after="0"/>
-        <w:rPr>
-          <w:lang w:val="ru-RU"/>
+        <w:ind w:left="0" w:firstLine="709"/>
+        <w:rPr>
+          <w:rFonts w:eastAsia="Times New Roman" w:cs="Times New Roman"/>
+          <w:szCs w:val="28"/>
+          <w:lang w:val="ru-RU" w:eastAsia="ru-RU"/>
         </w:rPr>
       </w:pPr>
       <w:r>
         <w:rPr>
-          <w:rFonts w:eastAsia="Times New Roman"/>
-          <w:lang w:val="ru-RU"/>
-        </w:rPr>
-        <w:t xml:space="preserve">3. Фаулер М. Шаблоны корпоративных приложений. </w:t>
-      </w:r>
-      <w:r>
-        <w:rPr>
-          <w:rFonts w:eastAsia="Times New Roman"/>
-          <w:lang w:val="ru-RU"/>
+          <w:rFonts w:eastAsia="Times New Roman" w:cs="Times New Roman"/>
+          <w:szCs w:val="28"/>
+          <w:lang w:val="ru-RU" w:eastAsia="ru-RU"/>
+        </w:rPr>
+        <w:t xml:space="preserve">Фаулер М. Шаблоны корпоративных приложений / М. Фаулер, Д. Райс и др. </w:t>
+      </w:r>
+      <w:r>
+        <w:rPr>
+          <w:rFonts w:eastAsia="Times New Roman" w:cs="Times New Roman"/>
+          <w:szCs w:val="28"/>
+          <w:lang w:val="ru-RU" w:eastAsia="ru-RU"/>
         </w:rPr>
         <w:t>-</w:t>
       </w:r>
       <w:r>
         <w:rPr>
-          <w:rFonts w:eastAsia="Times New Roman"/>
-          <w:lang w:val="ru-RU"/>
-        </w:rPr>
-        <w:t xml:space="preserve"> М.: Вильямс, 2016.</w:t>
+          <w:rFonts w:eastAsia="Times New Roman" w:cs="Times New Roman"/>
+          <w:szCs w:val="28"/>
+          <w:lang w:val="ru-RU" w:eastAsia="ru-RU"/>
+        </w:rPr>
+        <w:t xml:space="preserve"> </w:t>
+      </w:r>
+      <w:proofErr w:type="spellStart"/>
+      <w:r>
+        <w:rPr>
+          <w:rFonts w:eastAsia="Times New Roman" w:cs="Times New Roman"/>
+          <w:szCs w:val="28"/>
+          <w:lang w:val="ru-RU" w:eastAsia="ru-RU"/>
+        </w:rPr>
+        <w:t>Испр</w:t>
+      </w:r>
+      <w:proofErr w:type="spellEnd"/>
+      <w:r>
+        <w:rPr>
+          <w:rFonts w:eastAsia="Times New Roman" w:cs="Times New Roman"/>
+          <w:szCs w:val="28"/>
+          <w:lang w:val="ru-RU" w:eastAsia="ru-RU"/>
+        </w:rPr>
+        <w:t xml:space="preserve">. изд. </w:t>
+      </w:r>
+      <w:r>
+        <w:rPr>
+          <w:rFonts w:eastAsia="Times New Roman" w:cs="Times New Roman"/>
+          <w:szCs w:val="28"/>
+          <w:lang w:val="ru-RU" w:eastAsia="ru-RU"/>
+        </w:rPr>
+        <w:t>-</w:t>
+      </w:r>
+      <w:r>
+        <w:rPr>
+          <w:rFonts w:eastAsia="Times New Roman" w:cs="Times New Roman"/>
+          <w:szCs w:val="28"/>
+          <w:lang w:val="ru-RU" w:eastAsia="ru-RU"/>
+        </w:rPr>
+        <w:t xml:space="preserve"> М.: Вильямс, 2018. </w:t>
+      </w:r>
+      <w:r>
+        <w:rPr>
+          <w:rFonts w:eastAsia="Times New Roman" w:cs="Times New Roman"/>
+          <w:szCs w:val="28"/>
+          <w:lang w:val="ru-RU" w:eastAsia="ru-RU"/>
+        </w:rPr>
+        <w:t>-</w:t>
+      </w:r>
+      <w:r>
+        <w:rPr>
+          <w:rFonts w:eastAsia="Times New Roman" w:cs="Times New Roman"/>
+          <w:szCs w:val="28"/>
+          <w:lang w:val="ru-RU" w:eastAsia="ru-RU"/>
+        </w:rPr>
+        <w:t xml:space="preserve"> 539, [4] с.</w:t>
       </w:r>
     </w:p>
     <w:p>
       <w:pPr>
+        <w:pStyle w:val="a7"/>
+        <w:numPr>
+          <w:ilvl w:val="0"/>
+          <w:numId w:val="7"/>
+        </w:numPr>
+        <w:tabs>
+          <w:tab w:val="left" w:pos="993"/>
+        </w:tabs>
         <w:spacing w:after="0"/>
-        <w:rPr>
-          <w:lang w:val="ru-RU"/>
+        <w:ind w:left="0" w:firstLine="709"/>
+        <w:rPr>
+          <w:rFonts w:eastAsia="Times New Roman" w:cs="Times New Roman"/>
+          <w:szCs w:val="28"/>
+          <w:lang w:val="ru-RU" w:eastAsia="ru-RU"/>
         </w:rPr>
       </w:pPr>
       <w:r>
         <w:rPr>
-          <w:rFonts w:eastAsia="Times New Roman"/>
-          <w:lang w:val="ru-RU"/>
-        </w:rPr>
-        <w:t xml:space="preserve">4. Эванс Э. Предметно-ориентированное проектирование: структуризация сложных программных систем. </w:t>
-      </w:r>
-      <w:r>
-        <w:rPr>
-          <w:rFonts w:eastAsia="Times New Roman"/>
-          <w:lang w:val="ru-RU"/>
+          <w:rFonts w:eastAsia="Times New Roman" w:cs="Times New Roman"/>
+          <w:szCs w:val="28"/>
+          <w:lang w:val="ru-RU" w:eastAsia="ru-RU"/>
+        </w:rPr>
+        <w:t xml:space="preserve">Эванс Э. Предметно-ориентированное проектирование (DDD): структуризация сложных программных систем. </w:t>
+      </w:r>
+      <w:r>
+        <w:rPr>
+          <w:rFonts w:eastAsia="Times New Roman" w:cs="Times New Roman"/>
+          <w:szCs w:val="28"/>
+          <w:lang w:val="ru-RU" w:eastAsia="ru-RU"/>
         </w:rPr>
         <w:t>-</w:t>
       </w:r>
       <w:r>
         <w:rPr>
-          <w:rFonts w:eastAsia="Times New Roman"/>
-          <w:lang w:val="ru-RU"/>
+          <w:rFonts w:eastAsia="Times New Roman" w:cs="Times New Roman"/>
+          <w:szCs w:val="28"/>
+          <w:lang w:val="ru-RU" w:eastAsia="ru-RU"/>
         </w:rPr>
         <w:t xml:space="preserve"> М.: Вильямс, 2011.</w:t>
       </w:r>
     </w:p>
     <w:p>
       <w:pPr>
+        <w:pStyle w:val="a7"/>
+        <w:numPr>
+          <w:ilvl w:val="0"/>
+          <w:numId w:val="7"/>
+        </w:numPr>
+        <w:tabs>
+          <w:tab w:val="left" w:pos="993"/>
+        </w:tabs>
         <w:spacing w:after="0"/>
+        <w:ind w:left="0" w:firstLine="709"/>
+        <w:rPr>
+          <w:rFonts w:eastAsia="Times New Roman" w:cs="Times New Roman"/>
+          <w:szCs w:val="28"/>
+          <w:lang w:val="ru-RU" w:eastAsia="ru-RU"/>
+        </w:rPr>
       </w:pPr>
       <w:r>
         <w:rPr>
-          <w:rFonts w:eastAsia="Times New Roman"/>
-        </w:rPr>
-        <w:t xml:space="preserve">5. Spring Boot Reference Documentation. </w:t>
+          <w:rFonts w:eastAsia="Times New Roman" w:cs="Times New Roman"/>
+          <w:szCs w:val="28"/>
+          <w:lang w:val="ru-RU" w:eastAsia="ru-RU"/>
+        </w:rPr>
+        <w:t xml:space="preserve">Spring Boot </w:t>
       </w:r>
       <w:proofErr w:type="spellStart"/>
       <w:r>
         <w:rPr>
-          <w:rFonts w:eastAsia="Times New Roman"/>
-        </w:rPr>
-        <w:t>Официальная</w:t>
+          <w:rFonts w:eastAsia="Times New Roman" w:cs="Times New Roman"/>
+          <w:szCs w:val="28"/>
+          <w:lang w:val="ru-RU" w:eastAsia="ru-RU"/>
+        </w:rPr>
+        <w:t>Reference</w:t>
       </w:r>
       <w:proofErr w:type="spellEnd"/>
       <w:r>
         <w:rPr>
-          <w:rFonts w:eastAsia="Times New Roman"/>
+          <w:rFonts w:eastAsia="Times New Roman" w:cs="Times New Roman"/>
+          <w:szCs w:val="28"/>
+          <w:lang w:val="ru-RU" w:eastAsia="ru-RU"/>
         </w:rPr>
         <w:t xml:space="preserve"> </w:t>
       </w:r>
       <w:proofErr w:type="spellStart"/>
       <w:r>
         <w:rPr>
-          <w:rFonts w:eastAsia="Times New Roman"/>
-        </w:rPr>
-        <w:t>документация</w:t>
+          <w:rFonts w:eastAsia="Times New Roman" w:cs="Times New Roman"/>
+          <w:szCs w:val="28"/>
+          <w:lang w:val="ru-RU" w:eastAsia="ru-RU"/>
+        </w:rPr>
+        <w:t>Documentation</w:t>
       </w:r>
       <w:proofErr w:type="spellEnd"/>
       <w:r>
         <w:rPr>
-          <w:rFonts w:eastAsia="Times New Roman"/>
-        </w:rPr>
-        <w:t xml:space="preserve"> </w:t>
-      </w:r>
-      <w:proofErr w:type="spellStart"/>
-      <w:r>
-        <w:rPr>
-          <w:rFonts w:eastAsia="Times New Roman"/>
-        </w:rPr>
-        <w:t>фреймворка</w:t>
-      </w:r>
-      <w:proofErr w:type="spellEnd"/>
-      <w:r>
-        <w:rPr>
-          <w:rFonts w:eastAsia="Times New Roman"/>
-        </w:rPr>
-        <w:t xml:space="preserve"> Spring Boot.</w:t>
+          <w:rFonts w:eastAsia="Times New Roman" w:cs="Times New Roman"/>
+          <w:szCs w:val="28"/>
+          <w:lang w:val="ru-RU" w:eastAsia="ru-RU"/>
+        </w:rPr>
+        <w:t xml:space="preserve"> [Электронный ресурс]. </w:t>
+      </w:r>
+      <w:r>
+        <w:rPr>
+          <w:rFonts w:eastAsia="Times New Roman" w:cs="Times New Roman"/>
+          <w:szCs w:val="28"/>
+          <w:lang w:val="ru-RU" w:eastAsia="ru-RU"/>
+        </w:rPr>
+        <w:t>-</w:t>
+      </w:r>
+      <w:r>
+        <w:rPr>
+          <w:rFonts w:eastAsia="Times New Roman" w:cs="Times New Roman"/>
+          <w:szCs w:val="28"/>
+          <w:lang w:val="ru-RU" w:eastAsia="ru-RU"/>
+        </w:rPr>
+        <w:t xml:space="preserve"> Официальная документация Spring Boot.</w:t>
       </w:r>
     </w:p>
     <w:p>
       <w:pPr>
+        <w:pStyle w:val="a7"/>
+        <w:numPr>
+          <w:ilvl w:val="0"/>
+          <w:numId w:val="7"/>
+        </w:numPr>
+        <w:tabs>
+          <w:tab w:val="left" w:pos="993"/>
+        </w:tabs>
         <w:spacing w:after="0"/>
-        <w:rPr>
-          <w:lang w:val="ru-RU"/>
+        <w:ind w:left="0" w:firstLine="709"/>
+        <w:rPr>
+          <w:rFonts w:eastAsia="Times New Roman" w:cs="Times New Roman"/>
+          <w:szCs w:val="28"/>
+          <w:lang w:val="ru-RU" w:eastAsia="ru-RU"/>
         </w:rPr>
       </w:pPr>
       <w:r>
         <w:rPr>
-          <w:rFonts w:eastAsia="Times New Roman"/>
-          <w:lang w:val="ru-RU"/>
-        </w:rPr>
-        <w:t xml:space="preserve">6. </w:t>
-      </w:r>
-      <w:r>
-        <w:rPr>
-          <w:rFonts w:eastAsia="Times New Roman"/>
-        </w:rPr>
-        <w:t>Spring</w:t>
-      </w:r>
-      <w:r>
-        <w:rPr>
-          <w:rFonts w:eastAsia="Times New Roman"/>
-          <w:lang w:val="ru-RU"/>
-        </w:rPr>
-        <w:t xml:space="preserve"> </w:t>
-      </w:r>
-      <w:r>
-        <w:rPr>
-          <w:rFonts w:eastAsia="Times New Roman"/>
-        </w:rPr>
-        <w:t>Security</w:t>
-      </w:r>
-      <w:r>
-        <w:rPr>
-          <w:rFonts w:eastAsia="Times New Roman"/>
-          <w:lang w:val="ru-RU"/>
-        </w:rPr>
-        <w:t xml:space="preserve"> </w:t>
-      </w:r>
-      <w:r>
-        <w:rPr>
-          <w:rFonts w:eastAsia="Times New Roman"/>
+          <w:rFonts w:eastAsia="Times New Roman" w:cs="Times New Roman"/>
+          <w:szCs w:val="28"/>
+          <w:lang w:val="ru-RU" w:eastAsia="ru-RU"/>
+        </w:rPr>
+        <w:t xml:space="preserve">Spring Security </w:t>
+      </w:r>
+      <w:proofErr w:type="spellStart"/>
+      <w:r>
+        <w:rPr>
+          <w:rFonts w:eastAsia="Times New Roman" w:cs="Times New Roman"/>
+          <w:szCs w:val="28"/>
+          <w:lang w:val="ru-RU" w:eastAsia="ru-RU"/>
         </w:rPr>
         <w:t>Reference</w:t>
       </w:r>
-      <w:r>
-        <w:rPr>
-          <w:rFonts w:eastAsia="Times New Roman"/>
-          <w:lang w:val="ru-RU"/>
-        </w:rPr>
-        <w:t xml:space="preserve">. Официальная документация по аутентификации и авторизации </w:t>
-      </w:r>
-      <w:r>
-        <w:rPr>
-          <w:rFonts w:eastAsia="Times New Roman"/>
-        </w:rPr>
-        <w:t>Spring</w:t>
-      </w:r>
-      <w:r>
-        <w:rPr>
-          <w:rFonts w:eastAsia="Times New Roman"/>
-          <w:lang w:val="ru-RU"/>
-        </w:rPr>
-        <w:t xml:space="preserve"> </w:t>
-      </w:r>
-      <w:r>
-        <w:rPr>
-          <w:rFonts w:eastAsia="Times New Roman"/>
-        </w:rPr>
-        <w:t>Security</w:t>
-      </w:r>
-      <w:r>
-        <w:rPr>
-          <w:rFonts w:eastAsia="Times New Roman"/>
-          <w:lang w:val="ru-RU"/>
-        </w:rPr>
-        <w:t>.</w:t>
+      <w:proofErr w:type="spellEnd"/>
+      <w:r>
+        <w:rPr>
+          <w:rFonts w:eastAsia="Times New Roman" w:cs="Times New Roman"/>
+          <w:szCs w:val="28"/>
+          <w:lang w:val="ru-RU" w:eastAsia="ru-RU"/>
+        </w:rPr>
+        <w:t xml:space="preserve"> [Электронный ресурс]. </w:t>
+      </w:r>
+      <w:r>
+        <w:rPr>
+          <w:rFonts w:eastAsia="Times New Roman" w:cs="Times New Roman"/>
+          <w:szCs w:val="28"/>
+          <w:lang w:val="ru-RU" w:eastAsia="ru-RU"/>
+        </w:rPr>
+        <w:t>-</w:t>
+      </w:r>
+      <w:r>
+        <w:rPr>
+          <w:rFonts w:eastAsia="Times New Roman" w:cs="Times New Roman"/>
+          <w:szCs w:val="28"/>
+          <w:lang w:val="ru-RU" w:eastAsia="ru-RU"/>
+        </w:rPr>
+        <w:t xml:space="preserve"> Официальная документация по аутентификации, авторизации и защите приложений средствами Spring Security.</w:t>
       </w:r>
     </w:p>
     <w:p>
       <w:pPr>
+        <w:pStyle w:val="a7"/>
+        <w:numPr>
+          <w:ilvl w:val="0"/>
+          <w:numId w:val="7"/>
+        </w:numPr>
+        <w:tabs>
+          <w:tab w:val="left" w:pos="993"/>
+        </w:tabs>
         <w:spacing w:after="0"/>
-        <w:rPr>
-          <w:lang w:val="ru-RU"/>
+        <w:ind w:left="0" w:firstLine="709"/>
+        <w:rPr>
+          <w:rFonts w:eastAsia="Times New Roman" w:cs="Times New Roman"/>
+          <w:szCs w:val="28"/>
+          <w:lang w:eastAsia="ru-RU"/>
         </w:rPr>
       </w:pPr>
       <w:r>
         <w:rPr>
-          <w:rFonts w:eastAsia="Times New Roman"/>
-        </w:rPr>
-        <w:t xml:space="preserve">7. Spring Data JPA Reference Documentation. </w:t>
-      </w:r>
-      <w:r>
-        <w:rPr>
-          <w:rFonts w:eastAsia="Times New Roman"/>
-          <w:lang w:val="ru-RU"/>
-        </w:rPr>
-        <w:t>Официальная документация доступа к реляционным данным.</w:t>
+          <w:rFonts w:eastAsia="Times New Roman" w:cs="Times New Roman"/>
+          <w:szCs w:val="28"/>
+          <w:lang w:eastAsia="ru-RU"/>
+        </w:rPr>
+        <w:t>Spring Data JPA Reference Documentation [</w:t>
+      </w:r>
+      <w:r>
+        <w:rPr>
+          <w:rFonts w:eastAsia="Times New Roman" w:cs="Times New Roman"/>
+          <w:szCs w:val="28"/>
+          <w:lang w:val="ru-RU" w:eastAsia="ru-RU"/>
+        </w:rPr>
+        <w:t>Электронный</w:t>
+      </w:r>
+      <w:r>
+        <w:rPr>
+          <w:rFonts w:eastAsia="Times New Roman" w:cs="Times New Roman"/>
+          <w:szCs w:val="28"/>
+          <w:lang w:eastAsia="ru-RU"/>
+        </w:rPr>
+        <w:t xml:space="preserve"> </w:t>
+      </w:r>
+      <w:r>
+        <w:rPr>
+          <w:rFonts w:eastAsia="Times New Roman" w:cs="Times New Roman"/>
+          <w:szCs w:val="28"/>
+          <w:lang w:val="ru-RU" w:eastAsia="ru-RU"/>
+        </w:rPr>
+        <w:t>ресурс</w:t>
+      </w:r>
+      <w:r>
+        <w:rPr>
+          <w:rFonts w:eastAsia="Times New Roman" w:cs="Times New Roman"/>
+          <w:szCs w:val="28"/>
+          <w:lang w:eastAsia="ru-RU"/>
+        </w:rPr>
+        <w:t xml:space="preserve">]. </w:t>
+      </w:r>
+      <w:r>
+        <w:rPr>
+          <w:rFonts w:eastAsia="Times New Roman" w:cs="Times New Roman"/>
+          <w:szCs w:val="28"/>
+          <w:lang w:eastAsia="ru-RU"/>
+        </w:rPr>
+        <w:t>-</w:t>
+      </w:r>
+      <w:r>
+        <w:rPr>
+          <w:rFonts w:eastAsia="Times New Roman" w:cs="Times New Roman"/>
+          <w:szCs w:val="28"/>
+          <w:lang w:eastAsia="ru-RU"/>
+        </w:rPr>
+        <w:t xml:space="preserve"> </w:t>
+      </w:r>
+      <w:r>
+        <w:rPr>
+          <w:rFonts w:eastAsia="Times New Roman" w:cs="Times New Roman"/>
+          <w:szCs w:val="28"/>
+          <w:lang w:val="ru-RU" w:eastAsia="ru-RU"/>
+        </w:rPr>
+        <w:t>Официальная</w:t>
+      </w:r>
+      <w:r>
+        <w:rPr>
+          <w:rFonts w:eastAsia="Times New Roman" w:cs="Times New Roman"/>
+          <w:szCs w:val="28"/>
+          <w:lang w:eastAsia="ru-RU"/>
+        </w:rPr>
+        <w:t xml:space="preserve"> </w:t>
+      </w:r>
+      <w:r>
+        <w:rPr>
+          <w:rFonts w:eastAsia="Times New Roman" w:cs="Times New Roman"/>
+          <w:szCs w:val="28"/>
+          <w:lang w:val="ru-RU" w:eastAsia="ru-RU"/>
+        </w:rPr>
+        <w:t>документация</w:t>
+      </w:r>
+      <w:r>
+        <w:rPr>
+          <w:rFonts w:eastAsia="Times New Roman" w:cs="Times New Roman"/>
+          <w:szCs w:val="28"/>
+          <w:lang w:eastAsia="ru-RU"/>
+        </w:rPr>
+        <w:t xml:space="preserve"> Spring Data JPA.</w:t>
       </w:r>
     </w:p>
     <w:p>
       <w:pPr>
+        <w:pStyle w:val="a7"/>
+        <w:numPr>
+          <w:ilvl w:val="0"/>
+          <w:numId w:val="7"/>
+        </w:numPr>
+        <w:tabs>
+          <w:tab w:val="left" w:pos="993"/>
+        </w:tabs>
         <w:spacing w:after="0"/>
-        <w:rPr>
-          <w:lang w:val="ru-RU"/>
+        <w:ind w:left="0" w:firstLine="709"/>
+        <w:rPr>
+          <w:rFonts w:eastAsia="Times New Roman" w:cs="Times New Roman"/>
+          <w:szCs w:val="28"/>
+          <w:lang w:val="ru-RU" w:eastAsia="ru-RU"/>
         </w:rPr>
       </w:pPr>
-      <w:r>
-        <w:rPr>
-          <w:rFonts w:eastAsia="Times New Roman"/>
-          <w:lang w:val="ru-RU"/>
-        </w:rPr>
-        <w:t xml:space="preserve">8. </w:t>
-      </w:r>
-      <w:r>
-        <w:rPr>
-          <w:rFonts w:eastAsia="Times New Roman"/>
+      <w:proofErr w:type="spellStart"/>
+      <w:r>
+        <w:rPr>
+          <w:rFonts w:eastAsia="Times New Roman" w:cs="Times New Roman"/>
+          <w:szCs w:val="28"/>
+          <w:lang w:val="ru-RU" w:eastAsia="ru-RU"/>
         </w:rPr>
         <w:t>React</w:t>
       </w:r>
-      <w:r>
-        <w:rPr>
-          <w:rFonts w:eastAsia="Times New Roman"/>
-          <w:lang w:val="ru-RU"/>
+      <w:proofErr w:type="spellEnd"/>
+      <w:r>
+        <w:rPr>
+          <w:rFonts w:eastAsia="Times New Roman" w:cs="Times New Roman"/>
+          <w:szCs w:val="28"/>
+          <w:lang w:val="ru-RU" w:eastAsia="ru-RU"/>
         </w:rPr>
         <w:t xml:space="preserve"> </w:t>
       </w:r>
-      <w:r>
-        <w:rPr>
-          <w:rFonts w:eastAsia="Times New Roman"/>
+      <w:proofErr w:type="spellStart"/>
+      <w:r>
+        <w:rPr>
+          <w:rFonts w:eastAsia="Times New Roman" w:cs="Times New Roman"/>
+          <w:szCs w:val="28"/>
+          <w:lang w:val="ru-RU" w:eastAsia="ru-RU"/>
         </w:rPr>
         <w:t>Documentation</w:t>
       </w:r>
-      <w:r>
-        <w:rPr>
-          <w:rFonts w:eastAsia="Times New Roman"/>
-          <w:lang w:val="ru-RU"/>
-        </w:rPr>
-        <w:t xml:space="preserve">. Официальная документация библиотеки </w:t>
-      </w:r>
-      <w:r>
-        <w:rPr>
-          <w:rFonts w:eastAsia="Times New Roman"/>
+      <w:proofErr w:type="spellEnd"/>
+      <w:r>
+        <w:rPr>
+          <w:rFonts w:eastAsia="Times New Roman" w:cs="Times New Roman"/>
+          <w:szCs w:val="28"/>
+          <w:lang w:val="ru-RU" w:eastAsia="ru-RU"/>
+        </w:rPr>
+        <w:t xml:space="preserve"> [Электронный ресурс]. </w:t>
+      </w:r>
+      <w:r>
+        <w:rPr>
+          <w:rFonts w:eastAsia="Times New Roman" w:cs="Times New Roman"/>
+          <w:szCs w:val="28"/>
+          <w:lang w:val="ru-RU" w:eastAsia="ru-RU"/>
+        </w:rPr>
+        <w:t>-</w:t>
+      </w:r>
+      <w:r>
+        <w:rPr>
+          <w:rFonts w:eastAsia="Times New Roman" w:cs="Times New Roman"/>
+          <w:szCs w:val="28"/>
+          <w:lang w:val="ru-RU" w:eastAsia="ru-RU"/>
+        </w:rPr>
+        <w:t xml:space="preserve"> Официальная документация библиотеки </w:t>
+      </w:r>
+      <w:proofErr w:type="spellStart"/>
+      <w:r>
+        <w:rPr>
+          <w:rFonts w:eastAsia="Times New Roman" w:cs="Times New Roman"/>
+          <w:szCs w:val="28"/>
+          <w:lang w:val="ru-RU" w:eastAsia="ru-RU"/>
         </w:rPr>
         <w:t>React</w:t>
       </w:r>
-      <w:r>
-        <w:rPr>
-          <w:rFonts w:eastAsia="Times New Roman"/>
-          <w:lang w:val="ru-RU"/>
+      <w:proofErr w:type="spellEnd"/>
+      <w:r>
+        <w:rPr>
+          <w:rFonts w:eastAsia="Times New Roman" w:cs="Times New Roman"/>
+          <w:szCs w:val="28"/>
+          <w:lang w:val="ru-RU" w:eastAsia="ru-RU"/>
         </w:rPr>
         <w:t>.</w:t>
       </w:r>
     </w:p>
     <w:p>
       <w:pPr>
+        <w:pStyle w:val="a7"/>
+        <w:numPr>
+          <w:ilvl w:val="0"/>
+          <w:numId w:val="7"/>
+        </w:numPr>
+        <w:tabs>
+          <w:tab w:val="left" w:pos="993"/>
+        </w:tabs>
         <w:spacing w:after="0"/>
-        <w:rPr>
-          <w:lang w:val="ru-RU"/>
+        <w:ind w:left="0" w:firstLine="709"/>
+        <w:rPr>
+          <w:rFonts w:eastAsia="Times New Roman" w:cs="Times New Roman"/>
+          <w:szCs w:val="28"/>
+          <w:lang w:val="ru-RU" w:eastAsia="ru-RU"/>
         </w:rPr>
       </w:pPr>
-      <w:r>
-        <w:rPr>
-          <w:rFonts w:eastAsia="Times New Roman"/>
-          <w:lang w:val="ru-RU"/>
-        </w:rPr>
-        <w:t xml:space="preserve">9. </w:t>
-      </w:r>
-      <w:r>
-        <w:rPr>
-          <w:rFonts w:eastAsia="Times New Roman"/>
+      <w:proofErr w:type="spellStart"/>
+      <w:r>
+        <w:rPr>
+          <w:rFonts w:eastAsia="Times New Roman" w:cs="Times New Roman"/>
+          <w:szCs w:val="28"/>
+          <w:lang w:val="ru-RU" w:eastAsia="ru-RU"/>
         </w:rPr>
         <w:t>TypeScript</w:t>
       </w:r>
-      <w:r>
-        <w:rPr>
-          <w:rFonts w:eastAsia="Times New Roman"/>
-          <w:lang w:val="ru-RU"/>
+      <w:proofErr w:type="spellEnd"/>
+      <w:r>
+        <w:rPr>
+          <w:rFonts w:eastAsia="Times New Roman" w:cs="Times New Roman"/>
+          <w:szCs w:val="28"/>
+          <w:lang w:val="ru-RU" w:eastAsia="ru-RU"/>
         </w:rPr>
         <w:t xml:space="preserve"> </w:t>
       </w:r>
-      <w:r>
-        <w:rPr>
-          <w:rFonts w:eastAsia="Times New Roman"/>
+      <w:proofErr w:type="spellStart"/>
+      <w:r>
+        <w:rPr>
+          <w:rFonts w:eastAsia="Times New Roman" w:cs="Times New Roman"/>
+          <w:szCs w:val="28"/>
+          <w:lang w:val="ru-RU" w:eastAsia="ru-RU"/>
         </w:rPr>
         <w:t>Handbook</w:t>
       </w:r>
-      <w:r>
-        <w:rPr>
-          <w:rFonts w:eastAsia="Times New Roman"/>
-          <w:lang w:val="ru-RU"/>
-        </w:rPr>
-        <w:t xml:space="preserve">. Официальное руководство по языку </w:t>
-      </w:r>
-      <w:r>
-        <w:rPr>
-          <w:rFonts w:eastAsia="Times New Roman"/>
+      <w:proofErr w:type="spellEnd"/>
+      <w:r>
+        <w:rPr>
+          <w:rFonts w:eastAsia="Times New Roman" w:cs="Times New Roman"/>
+          <w:szCs w:val="28"/>
+          <w:lang w:val="ru-RU" w:eastAsia="ru-RU"/>
+        </w:rPr>
+        <w:t xml:space="preserve"> [Электронный ресурс]. </w:t>
+      </w:r>
+      <w:r>
+        <w:rPr>
+          <w:rFonts w:eastAsia="Times New Roman" w:cs="Times New Roman"/>
+          <w:szCs w:val="28"/>
+          <w:lang w:val="ru-RU" w:eastAsia="ru-RU"/>
+        </w:rPr>
+        <w:t>-</w:t>
+      </w:r>
+      <w:r>
+        <w:rPr>
+          <w:rFonts w:eastAsia="Times New Roman" w:cs="Times New Roman"/>
+          <w:szCs w:val="28"/>
+          <w:lang w:val="ru-RU" w:eastAsia="ru-RU"/>
+        </w:rPr>
+        <w:t xml:space="preserve"> Официальное руководство по языку </w:t>
+      </w:r>
+      <w:proofErr w:type="spellStart"/>
+      <w:r>
+        <w:rPr>
+          <w:rFonts w:eastAsia="Times New Roman" w:cs="Times New Roman"/>
+          <w:szCs w:val="28"/>
+          <w:lang w:val="ru-RU" w:eastAsia="ru-RU"/>
         </w:rPr>
         <w:t>TypeScript</w:t>
       </w:r>
-      <w:r>
-        <w:rPr>
-          <w:rFonts w:eastAsia="Times New Roman"/>
-          <w:lang w:val="ru-RU"/>
+      <w:proofErr w:type="spellEnd"/>
+      <w:r>
+        <w:rPr>
+          <w:rFonts w:eastAsia="Times New Roman" w:cs="Times New Roman"/>
+          <w:szCs w:val="28"/>
+          <w:lang w:val="ru-RU" w:eastAsia="ru-RU"/>
         </w:rPr>
         <w:t>.</w:t>
       </w:r>
     </w:p>
     <w:p>
       <w:pPr>
+        <w:pStyle w:val="a7"/>
+        <w:numPr>
+          <w:ilvl w:val="0"/>
+          <w:numId w:val="7"/>
+        </w:numPr>
+        <w:tabs>
+          <w:tab w:val="left" w:pos="993"/>
+        </w:tabs>
         <w:spacing w:after="0"/>
-        <w:rPr>
-          <w:lang w:val="ru-RU"/>
+        <w:ind w:left="0" w:firstLine="709"/>
+        <w:rPr>
+          <w:rFonts w:eastAsia="Times New Roman" w:cs="Times New Roman"/>
+          <w:szCs w:val="28"/>
+          <w:lang w:val="ru-RU" w:eastAsia="ru-RU"/>
         </w:rPr>
       </w:pPr>
-      <w:r>
-        <w:rPr>
-          <w:rFonts w:eastAsia="Times New Roman"/>
-          <w:lang w:val="ru-RU"/>
-        </w:rPr>
-        <w:t xml:space="preserve">10. </w:t>
-      </w:r>
-      <w:r>
-        <w:rPr>
-          <w:rFonts w:eastAsia="Times New Roman"/>
+      <w:proofErr w:type="spellStart"/>
+      <w:r>
+        <w:rPr>
+          <w:rFonts w:eastAsia="Times New Roman" w:cs="Times New Roman"/>
+          <w:szCs w:val="28"/>
+          <w:lang w:val="ru-RU" w:eastAsia="ru-RU"/>
         </w:rPr>
         <w:t>Vite</w:t>
       </w:r>
-      <w:r>
-        <w:rPr>
-          <w:rFonts w:eastAsia="Times New Roman"/>
-          <w:lang w:val="ru-RU"/>
-        </w:rPr>
-        <w:t xml:space="preserve"> </w:t>
-      </w:r>
-      <w:r>
-        <w:rPr>
-          <w:rFonts w:eastAsia="Times New Roman"/>
-        </w:rPr>
-        <w:t>Guide</w:t>
-      </w:r>
-      <w:r>
-        <w:rPr>
-          <w:rFonts w:eastAsia="Times New Roman"/>
-          <w:lang w:val="ru-RU"/>
-        </w:rPr>
-        <w:t xml:space="preserve">. Официальная документация инструмента сборки </w:t>
-      </w:r>
-      <w:r>
-        <w:rPr>
-          <w:rFonts w:eastAsia="Times New Roman"/>
+      <w:proofErr w:type="spellEnd"/>
+      <w:r>
+        <w:rPr>
+          <w:rFonts w:eastAsia="Times New Roman" w:cs="Times New Roman"/>
+          <w:szCs w:val="28"/>
+          <w:lang w:val="ru-RU" w:eastAsia="ru-RU"/>
+        </w:rPr>
+        <w:t xml:space="preserve"> Guide [Электронный ресурс]. </w:t>
+      </w:r>
+      <w:r>
+        <w:rPr>
+          <w:rFonts w:eastAsia="Times New Roman" w:cs="Times New Roman"/>
+          <w:szCs w:val="28"/>
+          <w:lang w:val="ru-RU" w:eastAsia="ru-RU"/>
+        </w:rPr>
+        <w:t>-</w:t>
+      </w:r>
+      <w:r>
+        <w:rPr>
+          <w:rFonts w:eastAsia="Times New Roman" w:cs="Times New Roman"/>
+          <w:szCs w:val="28"/>
+          <w:lang w:val="ru-RU" w:eastAsia="ru-RU"/>
+        </w:rPr>
+        <w:t xml:space="preserve"> Официальная документация инструмента разработки и сборки </w:t>
+      </w:r>
+      <w:proofErr w:type="spellStart"/>
+      <w:r>
+        <w:rPr>
+          <w:rFonts w:eastAsia="Times New Roman" w:cs="Times New Roman"/>
+          <w:szCs w:val="28"/>
+          <w:lang w:val="ru-RU" w:eastAsia="ru-RU"/>
         </w:rPr>
         <w:t>Vite</w:t>
       </w:r>
-      <w:r>
-        <w:rPr>
-          <w:rFonts w:eastAsia="Times New Roman"/>
-          <w:lang w:val="ru-RU"/>
+      <w:proofErr w:type="spellEnd"/>
+      <w:r>
+        <w:rPr>
+          <w:rFonts w:eastAsia="Times New Roman" w:cs="Times New Roman"/>
+          <w:szCs w:val="28"/>
+          <w:lang w:val="ru-RU" w:eastAsia="ru-RU"/>
         </w:rPr>
         <w:t>.</w:t>
       </w:r>
     </w:p>
     <w:p>
       <w:pPr>
+        <w:pStyle w:val="a7"/>
+        <w:numPr>
+          <w:ilvl w:val="0"/>
+          <w:numId w:val="7"/>
+        </w:numPr>
+        <w:tabs>
+          <w:tab w:val="left" w:pos="993"/>
+        </w:tabs>
         <w:spacing w:after="0"/>
-        <w:rPr>
-          <w:lang w:val="ru-RU"/>
+        <w:ind w:left="0" w:firstLine="709"/>
+        <w:rPr>
+          <w:rFonts w:eastAsia="Times New Roman" w:cs="Times New Roman"/>
+          <w:szCs w:val="28"/>
+          <w:lang w:val="ru-RU" w:eastAsia="ru-RU"/>
         </w:rPr>
       </w:pPr>
-      <w:r>
-        <w:rPr>
-          <w:rFonts w:eastAsia="Times New Roman"/>
-          <w:lang w:val="ru-RU"/>
-        </w:rPr>
-        <w:t xml:space="preserve">11. </w:t>
-      </w:r>
       <w:proofErr w:type="spellStart"/>
       <w:r>
         <w:rPr>
-          <w:rFonts w:eastAsia="Times New Roman"/>
+          <w:rFonts w:eastAsia="Times New Roman" w:cs="Times New Roman"/>
+          <w:szCs w:val="28"/>
+          <w:lang w:val="ru-RU" w:eastAsia="ru-RU"/>
+        </w:rPr>
+        <w:t>Getting</w:t>
+      </w:r>
+      <w:proofErr w:type="spellEnd"/>
+      <w:r>
+        <w:rPr>
+          <w:rFonts w:eastAsia="Times New Roman" w:cs="Times New Roman"/>
+          <w:szCs w:val="28"/>
+          <w:lang w:val="ru-RU" w:eastAsia="ru-RU"/>
+        </w:rPr>
+        <w:t xml:space="preserve"> </w:t>
+      </w:r>
+      <w:proofErr w:type="spellStart"/>
+      <w:r>
+        <w:rPr>
+          <w:rFonts w:eastAsia="Times New Roman" w:cs="Times New Roman"/>
+          <w:szCs w:val="28"/>
+          <w:lang w:val="ru-RU" w:eastAsia="ru-RU"/>
+        </w:rPr>
+        <w:t>Started</w:t>
+      </w:r>
+      <w:proofErr w:type="spellEnd"/>
+      <w:r>
+        <w:rPr>
+          <w:rFonts w:eastAsia="Times New Roman" w:cs="Times New Roman"/>
+          <w:szCs w:val="28"/>
+          <w:lang w:val="ru-RU" w:eastAsia="ru-RU"/>
+        </w:rPr>
+        <w:t xml:space="preserve"> </w:t>
+      </w:r>
+      <w:proofErr w:type="spellStart"/>
+      <w:r>
+        <w:rPr>
+          <w:rFonts w:eastAsia="Times New Roman" w:cs="Times New Roman"/>
+          <w:szCs w:val="28"/>
+          <w:lang w:val="ru-RU" w:eastAsia="ru-RU"/>
+        </w:rPr>
+        <w:t>with</w:t>
+      </w:r>
+      <w:proofErr w:type="spellEnd"/>
+      <w:r>
+        <w:rPr>
+          <w:rFonts w:eastAsia="Times New Roman" w:cs="Times New Roman"/>
+          <w:szCs w:val="28"/>
+          <w:lang w:val="ru-RU" w:eastAsia="ru-RU"/>
+        </w:rPr>
+        <w:t xml:space="preserve"> </w:t>
+      </w:r>
+      <w:proofErr w:type="spellStart"/>
+      <w:r>
+        <w:rPr>
+          <w:rFonts w:eastAsia="Times New Roman" w:cs="Times New Roman"/>
+          <w:szCs w:val="28"/>
+          <w:lang w:val="ru-RU" w:eastAsia="ru-RU"/>
+        </w:rPr>
+        <w:t>JavaFX</w:t>
+      </w:r>
+      <w:proofErr w:type="spellEnd"/>
+      <w:r>
+        <w:rPr>
+          <w:rFonts w:eastAsia="Times New Roman" w:cs="Times New Roman"/>
+          <w:szCs w:val="28"/>
+          <w:lang w:val="ru-RU" w:eastAsia="ru-RU"/>
+        </w:rPr>
+        <w:t xml:space="preserve"> [Электронный ресурс]. </w:t>
+      </w:r>
+      <w:r>
+        <w:rPr>
+          <w:rFonts w:eastAsia="Times New Roman" w:cs="Times New Roman"/>
+          <w:szCs w:val="28"/>
+          <w:lang w:val="ru-RU" w:eastAsia="ru-RU"/>
+        </w:rPr>
+        <w:t>-</w:t>
+      </w:r>
+      <w:r>
+        <w:rPr>
+          <w:rFonts w:eastAsia="Times New Roman" w:cs="Times New Roman"/>
+          <w:szCs w:val="28"/>
+          <w:lang w:val="ru-RU" w:eastAsia="ru-RU"/>
+        </w:rPr>
+        <w:t xml:space="preserve"> Официальная документация платформы </w:t>
+      </w:r>
+      <w:proofErr w:type="spellStart"/>
+      <w:r>
+        <w:rPr>
+          <w:rFonts w:eastAsia="Times New Roman" w:cs="Times New Roman"/>
+          <w:szCs w:val="28"/>
+          <w:lang w:val="ru-RU" w:eastAsia="ru-RU"/>
         </w:rPr>
         <w:t>OpenJFX</w:t>
       </w:r>
       <w:proofErr w:type="spellEnd"/>
       <w:r>
         <w:rPr>
-          <w:rFonts w:eastAsia="Times New Roman"/>
-          <w:lang w:val="ru-RU"/>
-        </w:rPr>
-        <w:t xml:space="preserve"> </w:t>
-      </w:r>
-      <w:r>
-        <w:rPr>
-          <w:rFonts w:eastAsia="Times New Roman"/>
-        </w:rPr>
-        <w:t>Documentation</w:t>
-      </w:r>
-      <w:r>
-        <w:rPr>
-          <w:rFonts w:eastAsia="Times New Roman"/>
-          <w:lang w:val="ru-RU"/>
-        </w:rPr>
-        <w:t xml:space="preserve">. Официальная документация платформы </w:t>
-      </w:r>
-      <w:r>
-        <w:rPr>
-          <w:rFonts w:eastAsia="Times New Roman"/>
-        </w:rPr>
-        <w:t>JavaFX</w:t>
-      </w:r>
-      <w:r>
-        <w:rPr>
-          <w:rFonts w:eastAsia="Times New Roman"/>
-          <w:lang w:val="ru-RU"/>
+          <w:rFonts w:eastAsia="Times New Roman" w:cs="Times New Roman"/>
+          <w:szCs w:val="28"/>
+          <w:lang w:val="ru-RU" w:eastAsia="ru-RU"/>
         </w:rPr>
         <w:t>.</w:t>
       </w:r>
     </w:p>
     <w:p>
       <w:pPr>
+        <w:pStyle w:val="a7"/>
+        <w:numPr>
+          <w:ilvl w:val="0"/>
+          <w:numId w:val="7"/>
+        </w:numPr>
+        <w:tabs>
+          <w:tab w:val="left" w:pos="993"/>
+        </w:tabs>
         <w:spacing w:after="0"/>
-        <w:rPr>
-          <w:lang w:val="ru-RU"/>
+        <w:ind w:left="0" w:firstLine="709"/>
+        <w:rPr>
+          <w:rFonts w:eastAsia="Times New Roman" w:cs="Times New Roman"/>
+          <w:szCs w:val="28"/>
+          <w:lang w:val="ru-RU" w:eastAsia="ru-RU"/>
         </w:rPr>
       </w:pPr>
-      <w:r>
-        <w:rPr>
-          <w:rFonts w:eastAsia="Times New Roman"/>
-          <w:lang w:val="ru-RU"/>
-        </w:rPr>
-        <w:t xml:space="preserve">12. </w:t>
-      </w:r>
-      <w:r>
-        <w:rPr>
-          <w:rFonts w:eastAsia="Times New Roman"/>
-        </w:rPr>
+      <w:proofErr w:type="spellStart"/>
+      <w:r>
+        <w:rPr>
+          <w:rFonts w:eastAsia="Times New Roman" w:cs="Times New Roman"/>
+          <w:szCs w:val="28"/>
+          <w:lang w:val="ru-RU" w:eastAsia="ru-RU"/>
+        </w:rPr>
+        <w:lastRenderedPageBreak/>
         <w:t>PostgreSQL</w:t>
       </w:r>
-      <w:r>
-        <w:rPr>
-          <w:rFonts w:eastAsia="Times New Roman"/>
-          <w:lang w:val="ru-RU"/>
+      <w:proofErr w:type="spellEnd"/>
+      <w:r>
+        <w:rPr>
+          <w:rFonts w:eastAsia="Times New Roman" w:cs="Times New Roman"/>
+          <w:szCs w:val="28"/>
+          <w:lang w:val="ru-RU" w:eastAsia="ru-RU"/>
         </w:rPr>
         <w:t xml:space="preserve"> </w:t>
       </w:r>
-      <w:r>
-        <w:rPr>
-          <w:rFonts w:eastAsia="Times New Roman"/>
+      <w:proofErr w:type="spellStart"/>
+      <w:r>
+        <w:rPr>
+          <w:rFonts w:eastAsia="Times New Roman" w:cs="Times New Roman"/>
+          <w:szCs w:val="28"/>
+          <w:lang w:val="ru-RU" w:eastAsia="ru-RU"/>
         </w:rPr>
         <w:t>Documentation</w:t>
       </w:r>
-      <w:r>
-        <w:rPr>
-          <w:rFonts w:eastAsia="Times New Roman"/>
-          <w:lang w:val="ru-RU"/>
-        </w:rPr>
-        <w:t xml:space="preserve">. Официальная документация СУБД </w:t>
-      </w:r>
-      <w:r>
-        <w:rPr>
-          <w:rFonts w:eastAsia="Times New Roman"/>
+      <w:proofErr w:type="spellEnd"/>
+      <w:r>
+        <w:rPr>
+          <w:rFonts w:eastAsia="Times New Roman" w:cs="Times New Roman"/>
+          <w:szCs w:val="28"/>
+          <w:lang w:val="ru-RU" w:eastAsia="ru-RU"/>
+        </w:rPr>
+        <w:t xml:space="preserve"> [Электронный ресурс]. </w:t>
+      </w:r>
+      <w:r>
+        <w:rPr>
+          <w:rFonts w:eastAsia="Times New Roman" w:cs="Times New Roman"/>
+          <w:szCs w:val="28"/>
+          <w:lang w:val="ru-RU" w:eastAsia="ru-RU"/>
+        </w:rPr>
+        <w:t>-</w:t>
+      </w:r>
+      <w:r>
+        <w:rPr>
+          <w:rFonts w:eastAsia="Times New Roman" w:cs="Times New Roman"/>
+          <w:szCs w:val="28"/>
+          <w:lang w:val="ru-RU" w:eastAsia="ru-RU"/>
+        </w:rPr>
+        <w:t xml:space="preserve"> Официальная документация системы управления базами данных </w:t>
+      </w:r>
+      <w:proofErr w:type="spellStart"/>
+      <w:r>
+        <w:rPr>
+          <w:rFonts w:eastAsia="Times New Roman" w:cs="Times New Roman"/>
+          <w:szCs w:val="28"/>
+          <w:lang w:val="ru-RU" w:eastAsia="ru-RU"/>
         </w:rPr>
         <w:t>PostgreSQL</w:t>
       </w:r>
-      <w:r>
-        <w:rPr>
-          <w:rFonts w:eastAsia="Times New Roman"/>
-          <w:lang w:val="ru-RU"/>
+      <w:proofErr w:type="spellEnd"/>
+      <w:r>
+        <w:rPr>
+          <w:rFonts w:eastAsia="Times New Roman" w:cs="Times New Roman"/>
+          <w:szCs w:val="28"/>
+          <w:lang w:val="ru-RU" w:eastAsia="ru-RU"/>
         </w:rPr>
         <w:t>.</w:t>
       </w:r>
     </w:p>
     <w:p>
       <w:pPr>
+        <w:pStyle w:val="a7"/>
+        <w:numPr>
+          <w:ilvl w:val="0"/>
+          <w:numId w:val="7"/>
+        </w:numPr>
+        <w:tabs>
+          <w:tab w:val="left" w:pos="993"/>
+        </w:tabs>
         <w:spacing w:after="0"/>
-        <w:rPr>
-          <w:lang w:val="ru-RU"/>
+        <w:ind w:left="0" w:firstLine="709"/>
+        <w:rPr>
+          <w:rFonts w:eastAsia="Times New Roman" w:cs="Times New Roman"/>
+          <w:szCs w:val="28"/>
+          <w:lang w:val="ru-RU" w:eastAsia="ru-RU"/>
         </w:rPr>
       </w:pPr>
-      <w:r>
-        <w:rPr>
-          <w:rFonts w:eastAsia="Times New Roman"/>
-          <w:lang w:val="ru-RU"/>
-        </w:rPr>
-        <w:lastRenderedPageBreak/>
-        <w:t xml:space="preserve">13. </w:t>
-      </w:r>
-      <w:r>
-        <w:rPr>
-          <w:rFonts w:eastAsia="Times New Roman"/>
+      <w:proofErr w:type="spellStart"/>
+      <w:r>
+        <w:rPr>
+          <w:rFonts w:eastAsia="Times New Roman" w:cs="Times New Roman"/>
+          <w:szCs w:val="28"/>
+          <w:lang w:val="ru-RU" w:eastAsia="ru-RU"/>
+        </w:rPr>
+        <w:t>Redgate</w:t>
+      </w:r>
+      <w:proofErr w:type="spellEnd"/>
+      <w:r>
+        <w:rPr>
+          <w:rFonts w:eastAsia="Times New Roman" w:cs="Times New Roman"/>
+          <w:szCs w:val="28"/>
+          <w:lang w:val="ru-RU" w:eastAsia="ru-RU"/>
+        </w:rPr>
+        <w:t xml:space="preserve"> </w:t>
+      </w:r>
+      <w:proofErr w:type="spellStart"/>
+      <w:r>
+        <w:rPr>
+          <w:rFonts w:eastAsia="Times New Roman" w:cs="Times New Roman"/>
+          <w:szCs w:val="28"/>
+          <w:lang w:val="ru-RU" w:eastAsia="ru-RU"/>
         </w:rPr>
         <w:t>Flyway</w:t>
       </w:r>
-      <w:r>
-        <w:rPr>
-          <w:rFonts w:eastAsia="Times New Roman"/>
-          <w:lang w:val="ru-RU"/>
+      <w:proofErr w:type="spellEnd"/>
+      <w:r>
+        <w:rPr>
+          <w:rFonts w:eastAsia="Times New Roman" w:cs="Times New Roman"/>
+          <w:szCs w:val="28"/>
+          <w:lang w:val="ru-RU" w:eastAsia="ru-RU"/>
         </w:rPr>
         <w:t xml:space="preserve"> </w:t>
       </w:r>
-      <w:r>
-        <w:rPr>
-          <w:rFonts w:eastAsia="Times New Roman"/>
+      <w:proofErr w:type="spellStart"/>
+      <w:r>
+        <w:rPr>
+          <w:rFonts w:eastAsia="Times New Roman" w:cs="Times New Roman"/>
+          <w:szCs w:val="28"/>
+          <w:lang w:val="ru-RU" w:eastAsia="ru-RU"/>
         </w:rPr>
         <w:t>Documentation</w:t>
       </w:r>
-      <w:r>
-        <w:rPr>
-          <w:rFonts w:eastAsia="Times New Roman"/>
-          <w:lang w:val="ru-RU"/>
-        </w:rPr>
-        <w:t>. Официальная документация системы миграций базы данных.</w:t>
+      <w:proofErr w:type="spellEnd"/>
+      <w:r>
+        <w:rPr>
+          <w:rFonts w:eastAsia="Times New Roman" w:cs="Times New Roman"/>
+          <w:szCs w:val="28"/>
+          <w:lang w:val="ru-RU" w:eastAsia="ru-RU"/>
+        </w:rPr>
+        <w:t xml:space="preserve"> [Электронный ресурс]. </w:t>
+      </w:r>
+      <w:r>
+        <w:rPr>
+          <w:rFonts w:eastAsia="Times New Roman" w:cs="Times New Roman"/>
+          <w:szCs w:val="28"/>
+          <w:lang w:val="ru-RU" w:eastAsia="ru-RU"/>
+        </w:rPr>
+        <w:t>-</w:t>
+      </w:r>
+      <w:r>
+        <w:rPr>
+          <w:rFonts w:eastAsia="Times New Roman" w:cs="Times New Roman"/>
+          <w:szCs w:val="28"/>
+          <w:lang w:val="ru-RU" w:eastAsia="ru-RU"/>
+        </w:rPr>
+        <w:t xml:space="preserve"> Официальная документация системы управления миграциями базы данных </w:t>
+      </w:r>
+      <w:proofErr w:type="spellStart"/>
+      <w:r>
+        <w:rPr>
+          <w:rFonts w:eastAsia="Times New Roman" w:cs="Times New Roman"/>
+          <w:szCs w:val="28"/>
+          <w:lang w:val="ru-RU" w:eastAsia="ru-RU"/>
+        </w:rPr>
+        <w:t>Flyway</w:t>
+      </w:r>
+      <w:proofErr w:type="spellEnd"/>
+      <w:r>
+        <w:rPr>
+          <w:rFonts w:eastAsia="Times New Roman" w:cs="Times New Roman"/>
+          <w:szCs w:val="28"/>
+          <w:lang w:val="ru-RU" w:eastAsia="ru-RU"/>
+        </w:rPr>
+        <w:t>.</w:t>
       </w:r>
     </w:p>
     <w:p>
       <w:pPr>
+        <w:pStyle w:val="a7"/>
+        <w:numPr>
+          <w:ilvl w:val="0"/>
+          <w:numId w:val="7"/>
+        </w:numPr>
+        <w:tabs>
+          <w:tab w:val="left" w:pos="993"/>
+        </w:tabs>
         <w:spacing w:after="0"/>
-        <w:rPr>
-          <w:lang w:val="ru-RU"/>
+        <w:ind w:left="0" w:firstLine="709"/>
+        <w:rPr>
+          <w:rFonts w:eastAsia="Times New Roman" w:cs="Times New Roman"/>
+          <w:szCs w:val="28"/>
+          <w:lang w:val="ru-RU" w:eastAsia="ru-RU"/>
         </w:rPr>
       </w:pPr>
-      <w:r>
-        <w:rPr>
-          <w:rFonts w:eastAsia="Times New Roman"/>
-          <w:lang w:val="ru-RU"/>
-        </w:rPr>
-        <w:t xml:space="preserve">14. </w:t>
-      </w:r>
-      <w:r>
-        <w:rPr>
-          <w:rFonts w:eastAsia="Times New Roman"/>
+      <w:proofErr w:type="spellStart"/>
+      <w:r>
+        <w:rPr>
+          <w:rFonts w:eastAsia="Times New Roman" w:cs="Times New Roman"/>
+          <w:szCs w:val="28"/>
+          <w:lang w:val="ru-RU" w:eastAsia="ru-RU"/>
         </w:rPr>
         <w:t>Gradle</w:t>
       </w:r>
-      <w:r>
-        <w:rPr>
-          <w:rFonts w:eastAsia="Times New Roman"/>
-          <w:lang w:val="ru-RU"/>
-        </w:rPr>
-        <w:t xml:space="preserve"> </w:t>
-      </w:r>
-      <w:r>
-        <w:rPr>
-          <w:rFonts w:eastAsia="Times New Roman"/>
-        </w:rPr>
-        <w:t>User</w:t>
-      </w:r>
-      <w:r>
-        <w:rPr>
-          <w:rFonts w:eastAsia="Times New Roman"/>
-          <w:lang w:val="ru-RU"/>
-        </w:rPr>
-        <w:t xml:space="preserve"> </w:t>
-      </w:r>
-      <w:r>
-        <w:rPr>
-          <w:rFonts w:eastAsia="Times New Roman"/>
+      <w:proofErr w:type="spellEnd"/>
+      <w:r>
+        <w:rPr>
+          <w:rFonts w:eastAsia="Times New Roman" w:cs="Times New Roman"/>
+          <w:szCs w:val="28"/>
+          <w:lang w:val="ru-RU" w:eastAsia="ru-RU"/>
+        </w:rPr>
+        <w:t xml:space="preserve"> User </w:t>
+      </w:r>
+      <w:proofErr w:type="spellStart"/>
+      <w:r>
+        <w:rPr>
+          <w:rFonts w:eastAsia="Times New Roman" w:cs="Times New Roman"/>
+          <w:szCs w:val="28"/>
+          <w:lang w:val="ru-RU" w:eastAsia="ru-RU"/>
         </w:rPr>
         <w:t>Manual</w:t>
       </w:r>
-      <w:r>
-        <w:rPr>
-          <w:rFonts w:eastAsia="Times New Roman"/>
-          <w:lang w:val="ru-RU"/>
-        </w:rPr>
-        <w:t xml:space="preserve">. Официальное руководство системы сборки </w:t>
-      </w:r>
-      <w:r>
-        <w:rPr>
-          <w:rFonts w:eastAsia="Times New Roman"/>
+      <w:proofErr w:type="spellEnd"/>
+      <w:r>
+        <w:rPr>
+          <w:rFonts w:eastAsia="Times New Roman" w:cs="Times New Roman"/>
+          <w:szCs w:val="28"/>
+          <w:lang w:val="ru-RU" w:eastAsia="ru-RU"/>
+        </w:rPr>
+        <w:t xml:space="preserve"> [Электронный ресурс]. </w:t>
+      </w:r>
+      <w:r>
+        <w:rPr>
+          <w:rFonts w:eastAsia="Times New Roman" w:cs="Times New Roman"/>
+          <w:szCs w:val="28"/>
+          <w:lang w:val="ru-RU" w:eastAsia="ru-RU"/>
+        </w:rPr>
+        <w:t>-</w:t>
+      </w:r>
+      <w:r>
+        <w:rPr>
+          <w:rFonts w:eastAsia="Times New Roman" w:cs="Times New Roman"/>
+          <w:szCs w:val="28"/>
+          <w:lang w:val="ru-RU" w:eastAsia="ru-RU"/>
+        </w:rPr>
+        <w:t xml:space="preserve"> Официальное руководство системы автоматизации сборки </w:t>
+      </w:r>
+      <w:proofErr w:type="spellStart"/>
+      <w:r>
+        <w:rPr>
+          <w:rFonts w:eastAsia="Times New Roman" w:cs="Times New Roman"/>
+          <w:szCs w:val="28"/>
+          <w:lang w:val="ru-RU" w:eastAsia="ru-RU"/>
         </w:rPr>
         <w:t>Gradle</w:t>
       </w:r>
-      <w:r>
-        <w:rPr>
-          <w:rFonts w:eastAsia="Times New Roman"/>
-          <w:lang w:val="ru-RU"/>
+      <w:proofErr w:type="spellEnd"/>
+      <w:r>
+        <w:rPr>
+          <w:rFonts w:eastAsia="Times New Roman" w:cs="Times New Roman"/>
+          <w:szCs w:val="28"/>
+          <w:lang w:val="ru-RU" w:eastAsia="ru-RU"/>
         </w:rPr>
         <w:t>.</w:t>
       </w:r>
     </w:p>
     <w:p>
       <w:pPr>
+        <w:pStyle w:val="a7"/>
+        <w:numPr>
+          <w:ilvl w:val="0"/>
+          <w:numId w:val="7"/>
+        </w:numPr>
+        <w:tabs>
+          <w:tab w:val="left" w:pos="993"/>
+        </w:tabs>
         <w:spacing w:after="0"/>
-        <w:rPr>
-          <w:lang w:val="ru-RU"/>
+        <w:ind w:left="0" w:firstLine="709"/>
+        <w:rPr>
+          <w:rFonts w:eastAsia="Times New Roman" w:cs="Times New Roman"/>
+          <w:szCs w:val="28"/>
+          <w:lang w:val="ru-RU" w:eastAsia="ru-RU"/>
         </w:rPr>
       </w:pPr>
-      <w:r>
-        <w:rPr>
-          <w:rFonts w:eastAsia="Times New Roman"/>
-          <w:lang w:val="ru-RU"/>
-        </w:rPr>
-        <w:t xml:space="preserve">15. </w:t>
-      </w:r>
-      <w:r>
-        <w:rPr>
-          <w:rFonts w:eastAsia="Times New Roman"/>
+      <w:proofErr w:type="spellStart"/>
+      <w:r>
+        <w:rPr>
+          <w:rFonts w:eastAsia="Times New Roman" w:cs="Times New Roman"/>
+          <w:szCs w:val="28"/>
+          <w:lang w:val="ru-RU" w:eastAsia="ru-RU"/>
         </w:rPr>
         <w:t>Docker</w:t>
       </w:r>
-      <w:r>
-        <w:rPr>
-          <w:rFonts w:eastAsia="Times New Roman"/>
-          <w:lang w:val="ru-RU"/>
+      <w:proofErr w:type="spellEnd"/>
+      <w:r>
+        <w:rPr>
+          <w:rFonts w:eastAsia="Times New Roman" w:cs="Times New Roman"/>
+          <w:szCs w:val="28"/>
+          <w:lang w:val="ru-RU" w:eastAsia="ru-RU"/>
         </w:rPr>
         <w:t xml:space="preserve"> </w:t>
       </w:r>
-      <w:r>
-        <w:rPr>
-          <w:rFonts w:eastAsia="Times New Roman"/>
+      <w:proofErr w:type="spellStart"/>
+      <w:r>
+        <w:rPr>
+          <w:rFonts w:eastAsia="Times New Roman" w:cs="Times New Roman"/>
+          <w:szCs w:val="28"/>
+          <w:lang w:val="ru-RU" w:eastAsia="ru-RU"/>
         </w:rPr>
         <w:t>Compose</w:t>
       </w:r>
-      <w:r>
-        <w:rPr>
-          <w:rFonts w:eastAsia="Times New Roman"/>
-          <w:lang w:val="ru-RU"/>
+      <w:proofErr w:type="spellEnd"/>
+      <w:r>
+        <w:rPr>
+          <w:rFonts w:eastAsia="Times New Roman" w:cs="Times New Roman"/>
+          <w:szCs w:val="28"/>
+          <w:lang w:val="ru-RU" w:eastAsia="ru-RU"/>
         </w:rPr>
         <w:t xml:space="preserve"> </w:t>
       </w:r>
-      <w:r>
-        <w:rPr>
-          <w:rFonts w:eastAsia="Times New Roman"/>
+      <w:proofErr w:type="spellStart"/>
+      <w:r>
+        <w:rPr>
+          <w:rFonts w:eastAsia="Times New Roman" w:cs="Times New Roman"/>
+          <w:szCs w:val="28"/>
+          <w:lang w:val="ru-RU" w:eastAsia="ru-RU"/>
         </w:rPr>
         <w:t>Documentation</w:t>
       </w:r>
-      <w:r>
-        <w:rPr>
-          <w:rFonts w:eastAsia="Times New Roman"/>
-          <w:lang w:val="ru-RU"/>
-        </w:rPr>
-        <w:t xml:space="preserve">. Официальное руководство по </w:t>
+      <w:proofErr w:type="spellEnd"/>
+      <w:r>
+        <w:rPr>
+          <w:rFonts w:eastAsia="Times New Roman" w:cs="Times New Roman"/>
+          <w:szCs w:val="28"/>
+          <w:lang w:val="ru-RU" w:eastAsia="ru-RU"/>
+        </w:rPr>
+        <w:t xml:space="preserve"> [Электронный ресурс]. </w:t>
+      </w:r>
+      <w:r>
+        <w:rPr>
+          <w:rFonts w:eastAsia="Times New Roman" w:cs="Times New Roman"/>
+          <w:szCs w:val="28"/>
+          <w:lang w:val="ru-RU" w:eastAsia="ru-RU"/>
+        </w:rPr>
+        <w:t>-</w:t>
+      </w:r>
+      <w:r>
+        <w:rPr>
+          <w:rFonts w:eastAsia="Times New Roman" w:cs="Times New Roman"/>
+          <w:szCs w:val="28"/>
+          <w:lang w:val="ru-RU" w:eastAsia="ru-RU"/>
+        </w:rPr>
+        <w:t xml:space="preserve"> Официальное руководство по определению и запуску </w:t>
       </w:r>
       <w:proofErr w:type="spellStart"/>
       <w:r>
         <w:rPr>
-          <w:rFonts w:eastAsia="Times New Roman"/>
-          <w:lang w:val="ru-RU"/>
-        </w:rPr>
-        <w:t>оркестрации</w:t>
+          <w:rFonts w:eastAsia="Times New Roman" w:cs="Times New Roman"/>
+          <w:szCs w:val="28"/>
+          <w:lang w:val="ru-RU" w:eastAsia="ru-RU"/>
+        </w:rPr>
+        <w:t>многоконтейнерных</w:t>
       </w:r>
       <w:proofErr w:type="spellEnd"/>
       <w:r>
         <w:rPr>
-          <w:rFonts w:eastAsia="Times New Roman"/>
-          <w:lang w:val="ru-RU"/>
-        </w:rPr>
-        <w:t xml:space="preserve"> локальной инфраструктуры.</w:t>
+          <w:rFonts w:eastAsia="Times New Roman" w:cs="Times New Roman"/>
+          <w:szCs w:val="28"/>
+          <w:lang w:val="ru-RU" w:eastAsia="ru-RU"/>
+        </w:rPr>
+        <w:t xml:space="preserve"> приложений.</w:t>
       </w:r>
     </w:p>
     <w:p>
       <w:pPr>
+        <w:pStyle w:val="a7"/>
+        <w:numPr>
+          <w:ilvl w:val="0"/>
+          <w:numId w:val="7"/>
+        </w:numPr>
+        <w:tabs>
+          <w:tab w:val="left" w:pos="993"/>
+        </w:tabs>
         <w:spacing w:after="0"/>
+        <w:ind w:left="0" w:firstLine="709"/>
+        <w:rPr>
+          <w:rFonts w:eastAsia="Times New Roman" w:cs="Times New Roman"/>
+          <w:szCs w:val="28"/>
+          <w:lang w:eastAsia="ru-RU"/>
+        </w:rPr>
       </w:pPr>
       <w:r>
         <w:rPr>
-          <w:rFonts w:eastAsia="Times New Roman"/>
-        </w:rPr>
-        <w:t>16. RFC 7519. JSON Web Token (JWT). Internet Engineering Task Force, 2015.</w:t>
+          <w:rFonts w:eastAsia="Times New Roman" w:cs="Times New Roman"/>
+          <w:szCs w:val="28"/>
+          <w:lang w:eastAsia="ru-RU"/>
+        </w:rPr>
+        <w:t xml:space="preserve">Jones M., Bradley J., </w:t>
+      </w:r>
+      <w:proofErr w:type="spellStart"/>
+      <w:r>
+        <w:rPr>
+          <w:rFonts w:eastAsia="Times New Roman" w:cs="Times New Roman"/>
+          <w:szCs w:val="28"/>
+          <w:lang w:eastAsia="ru-RU"/>
+        </w:rPr>
+        <w:t>Sakimura</w:t>
+      </w:r>
+      <w:proofErr w:type="spellEnd"/>
+      <w:r>
+        <w:rPr>
+          <w:rFonts w:eastAsia="Times New Roman" w:cs="Times New Roman"/>
+          <w:szCs w:val="28"/>
+          <w:lang w:eastAsia="ru-RU"/>
+        </w:rPr>
+        <w:t xml:space="preserve"> N. JSON Web Token (JWT). </w:t>
+      </w:r>
+      <w:r>
+        <w:rPr>
+          <w:rFonts w:eastAsia="Times New Roman" w:cs="Times New Roman"/>
+          <w:szCs w:val="28"/>
+          <w:lang w:eastAsia="ru-RU"/>
+        </w:rPr>
+        <w:t>-</w:t>
+      </w:r>
+      <w:r>
+        <w:rPr>
+          <w:rFonts w:eastAsia="Times New Roman" w:cs="Times New Roman"/>
+          <w:szCs w:val="28"/>
+          <w:lang w:eastAsia="ru-RU"/>
+        </w:rPr>
+        <w:t xml:space="preserve"> RFC 7519. </w:t>
+      </w:r>
+      <w:r>
+        <w:rPr>
+          <w:rFonts w:eastAsia="Times New Roman" w:cs="Times New Roman"/>
+          <w:szCs w:val="28"/>
+          <w:lang w:eastAsia="ru-RU"/>
+        </w:rPr>
+        <w:t>-</w:t>
+      </w:r>
+      <w:r>
+        <w:rPr>
+          <w:rFonts w:eastAsia="Times New Roman" w:cs="Times New Roman"/>
+          <w:szCs w:val="28"/>
+          <w:lang w:eastAsia="ru-RU"/>
+        </w:rPr>
+        <w:t xml:space="preserve"> Internet Engineering Task Force, 2015.</w:t>
       </w:r>
     </w:p>
     <w:p>
       <w:pPr>
+        <w:pStyle w:val="a7"/>
+        <w:numPr>
+          <w:ilvl w:val="0"/>
+          <w:numId w:val="7"/>
+        </w:numPr>
+        <w:tabs>
+          <w:tab w:val="left" w:pos="993"/>
+        </w:tabs>
         <w:spacing w:after="0"/>
+        <w:ind w:left="0" w:firstLine="709"/>
+        <w:rPr>
+          <w:rFonts w:eastAsia="Times New Roman" w:cs="Times New Roman"/>
+          <w:szCs w:val="28"/>
+          <w:lang w:eastAsia="ru-RU"/>
+        </w:rPr>
       </w:pPr>
       <w:r>
         <w:rPr>
-          <w:rFonts w:eastAsia="Times New Roman"/>
-        </w:rPr>
-        <w:t>17. RFC 6749. The OAuth 2.0 Authorization Framework. Internet Engineering Task Force, 2012.</w:t>
+          <w:rFonts w:eastAsia="Times New Roman" w:cs="Times New Roman"/>
+          <w:szCs w:val="28"/>
+          <w:lang w:eastAsia="ru-RU"/>
+        </w:rPr>
+        <w:t xml:space="preserve">Hardt D. The OAuth 2.0 Authorization Framework. </w:t>
+      </w:r>
+      <w:r>
+        <w:rPr>
+          <w:rFonts w:eastAsia="Times New Roman" w:cs="Times New Roman"/>
+          <w:szCs w:val="28"/>
+          <w:lang w:eastAsia="ru-RU"/>
+        </w:rPr>
+        <w:t>-</w:t>
+      </w:r>
+      <w:r>
+        <w:rPr>
+          <w:rFonts w:eastAsia="Times New Roman" w:cs="Times New Roman"/>
+          <w:szCs w:val="28"/>
+          <w:lang w:eastAsia="ru-RU"/>
+        </w:rPr>
+        <w:t xml:space="preserve"> RFC 6749. </w:t>
+      </w:r>
+      <w:r>
+        <w:rPr>
+          <w:rFonts w:eastAsia="Times New Roman" w:cs="Times New Roman"/>
+          <w:szCs w:val="28"/>
+          <w:lang w:eastAsia="ru-RU"/>
+        </w:rPr>
+        <w:t>-</w:t>
+      </w:r>
+      <w:r>
+        <w:rPr>
+          <w:rFonts w:eastAsia="Times New Roman" w:cs="Times New Roman"/>
+          <w:szCs w:val="28"/>
+          <w:lang w:eastAsia="ru-RU"/>
+        </w:rPr>
+        <w:t xml:space="preserve"> Internet Engineering Task Force, 2012.</w:t>
       </w:r>
     </w:p>
     <w:p>
       <w:pPr>
+        <w:pStyle w:val="a7"/>
+        <w:numPr>
+          <w:ilvl w:val="0"/>
+          <w:numId w:val="7"/>
+        </w:numPr>
+        <w:tabs>
+          <w:tab w:val="left" w:pos="993"/>
+        </w:tabs>
         <w:spacing w:after="0"/>
+        <w:ind w:left="0" w:firstLine="709"/>
+        <w:rPr>
+          <w:rFonts w:eastAsia="Times New Roman" w:cs="Times New Roman"/>
+          <w:szCs w:val="28"/>
+          <w:lang w:val="ru-RU" w:eastAsia="ru-RU"/>
+        </w:rPr>
       </w:pPr>
-      <w:r>
-        <w:rPr>
-          <w:rFonts w:eastAsia="Times New Roman"/>
-        </w:rPr>
-        <w:t xml:space="preserve">18. </w:t>
-      </w:r>
       <w:proofErr w:type="spellStart"/>
       <w:r>
         <w:rPr>
-          <w:rFonts w:eastAsia="Times New Roman"/>
+          <w:rFonts w:eastAsia="Times New Roman" w:cs="Times New Roman"/>
+          <w:szCs w:val="28"/>
+          <w:lang w:eastAsia="ru-RU"/>
         </w:rPr>
         <w:t>OpenAPI</w:t>
       </w:r>
       <w:proofErr w:type="spellEnd"/>
       <w:r>
         <w:rPr>
-          <w:rFonts w:eastAsia="Times New Roman"/>
-        </w:rPr>
-        <w:t xml:space="preserve"> Specification. </w:t>
+          <w:rFonts w:eastAsia="Times New Roman" w:cs="Times New Roman"/>
+          <w:szCs w:val="28"/>
+          <w:lang w:eastAsia="ru-RU"/>
+        </w:rPr>
+        <w:t xml:space="preserve"> Initiative. </w:t>
       </w:r>
       <w:proofErr w:type="spellStart"/>
       <w:r>
         <w:rPr>
-          <w:rFonts w:eastAsia="Times New Roman"/>
-        </w:rPr>
-        <w:t>Спецификация</w:t>
+          <w:rFonts w:eastAsia="Times New Roman" w:cs="Times New Roman"/>
+          <w:szCs w:val="28"/>
+          <w:lang w:eastAsia="ru-RU"/>
+        </w:rPr>
+        <w:t>OpenAPI</w:t>
       </w:r>
       <w:proofErr w:type="spellEnd"/>
       <w:r>
         <w:rPr>
-          <w:rFonts w:eastAsia="Times New Roman"/>
+          <w:rFonts w:eastAsia="Times New Roman" w:cs="Times New Roman"/>
+          <w:szCs w:val="28"/>
+          <w:lang w:val="ru-RU" w:eastAsia="ru-RU"/>
         </w:rPr>
         <w:t xml:space="preserve"> </w:t>
       </w:r>
-      <w:proofErr w:type="spellStart"/>
-      <w:r>
-        <w:rPr>
-          <w:rFonts w:eastAsia="Times New Roman"/>
-        </w:rPr>
-        <w:t>описания</w:t>
-      </w:r>
-      <w:proofErr w:type="spellEnd"/>
-      <w:r>
-        <w:rPr>
-          <w:rFonts w:eastAsia="Times New Roman"/>
-        </w:rPr>
-        <w:t xml:space="preserve"> HTTP API.</w:t>
+      <w:r>
+        <w:rPr>
+          <w:rFonts w:eastAsia="Times New Roman" w:cs="Times New Roman"/>
+          <w:szCs w:val="28"/>
+          <w:lang w:eastAsia="ru-RU"/>
+        </w:rPr>
+        <w:t>Specification</w:t>
+      </w:r>
+      <w:r>
+        <w:rPr>
+          <w:rFonts w:eastAsia="Times New Roman" w:cs="Times New Roman"/>
+          <w:szCs w:val="28"/>
+          <w:lang w:val="ru-RU" w:eastAsia="ru-RU"/>
+        </w:rPr>
+        <w:t xml:space="preserve"> [Электронный ресурс]. </w:t>
+      </w:r>
+      <w:r>
+        <w:rPr>
+          <w:rFonts w:eastAsia="Times New Roman" w:cs="Times New Roman"/>
+          <w:szCs w:val="28"/>
+          <w:lang w:val="ru-RU" w:eastAsia="ru-RU"/>
+        </w:rPr>
+        <w:t>-</w:t>
+      </w:r>
+      <w:r>
+        <w:rPr>
+          <w:rFonts w:eastAsia="Times New Roman" w:cs="Times New Roman"/>
+          <w:szCs w:val="28"/>
+          <w:lang w:val="ru-RU" w:eastAsia="ru-RU"/>
+        </w:rPr>
+        <w:t xml:space="preserve"> Спецификация описания </w:t>
+      </w:r>
+      <w:r>
+        <w:rPr>
+          <w:rFonts w:eastAsia="Times New Roman" w:cs="Times New Roman"/>
+          <w:szCs w:val="28"/>
+          <w:lang w:eastAsia="ru-RU"/>
+        </w:rPr>
+        <w:t>HTTP</w:t>
+      </w:r>
+      <w:r>
+        <w:rPr>
+          <w:rFonts w:eastAsia="Times New Roman" w:cs="Times New Roman"/>
+          <w:szCs w:val="28"/>
+          <w:lang w:val="ru-RU" w:eastAsia="ru-RU"/>
+        </w:rPr>
+        <w:t xml:space="preserve"> </w:t>
+      </w:r>
+      <w:r>
+        <w:rPr>
+          <w:rFonts w:eastAsia="Times New Roman" w:cs="Times New Roman"/>
+          <w:szCs w:val="28"/>
+          <w:lang w:eastAsia="ru-RU"/>
+        </w:rPr>
+        <w:t>API</w:t>
+      </w:r>
+      <w:r>
+        <w:rPr>
+          <w:rFonts w:eastAsia="Times New Roman" w:cs="Times New Roman"/>
+          <w:szCs w:val="28"/>
+          <w:lang w:val="ru-RU" w:eastAsia="ru-RU"/>
+        </w:rPr>
+        <w:t>.</w:t>
       </w:r>
     </w:p>
     <w:p>
       <w:pPr>
+        <w:pStyle w:val="a7"/>
+        <w:numPr>
+          <w:ilvl w:val="0"/>
+          <w:numId w:val="7"/>
+        </w:numPr>
+        <w:tabs>
+          <w:tab w:val="left" w:pos="993"/>
+        </w:tabs>
         <w:spacing w:after="0"/>
-        <w:rPr>
-          <w:lang w:val="ru-RU"/>
+        <w:ind w:left="0" w:firstLine="709"/>
+        <w:rPr>
+          <w:rFonts w:eastAsia="Times New Roman" w:cs="Times New Roman"/>
+          <w:szCs w:val="28"/>
+          <w:lang w:eastAsia="ru-RU"/>
         </w:rPr>
       </w:pPr>
       <w:r>
         <w:rPr>
-          <w:rFonts w:eastAsia="Times New Roman"/>
-        </w:rPr>
-        <w:t xml:space="preserve">19. Oracle </w:t>
+          <w:rFonts w:eastAsia="Times New Roman" w:cs="Times New Roman"/>
+          <w:szCs w:val="28"/>
+          <w:lang w:eastAsia="ru-RU"/>
+        </w:rPr>
+        <w:t xml:space="preserve">Oracle. Java Platform, Standard Edition. </w:t>
       </w:r>
       <w:proofErr w:type="spellStart"/>
       <w:r>
         <w:rPr>
-          <w:rFonts w:eastAsia="Times New Roman"/>
-        </w:rPr>
-        <w:t>jpackage</w:t>
+          <w:rFonts w:eastAsia="Times New Roman" w:cs="Times New Roman"/>
+          <w:szCs w:val="28"/>
+          <w:lang w:val="ru-RU" w:eastAsia="ru-RU"/>
+        </w:rPr>
+        <w:t>Packaging</w:t>
       </w:r>
       <w:proofErr w:type="spellEnd"/>
       <w:r>
         <w:rPr>
-          <w:rFonts w:eastAsia="Times New Roman"/>
+          <w:rFonts w:eastAsia="Times New Roman" w:cs="Times New Roman"/>
+          <w:szCs w:val="28"/>
+          <w:lang w:val="ru-RU" w:eastAsia="ru-RU"/>
+        </w:rPr>
+        <w:t xml:space="preserve"> Tool </w:t>
+      </w:r>
+      <w:proofErr w:type="spellStart"/>
+      <w:r>
+        <w:rPr>
+          <w:rFonts w:eastAsia="Times New Roman" w:cs="Times New Roman"/>
+          <w:szCs w:val="28"/>
+          <w:lang w:val="ru-RU" w:eastAsia="ru-RU"/>
+        </w:rPr>
+        <w:t>User’s</w:t>
+      </w:r>
+      <w:proofErr w:type="spellEnd"/>
+      <w:r>
+        <w:rPr>
+          <w:rFonts w:eastAsia="Times New Roman" w:cs="Times New Roman"/>
+          <w:szCs w:val="28"/>
+          <w:lang w:val="ru-RU" w:eastAsia="ru-RU"/>
         </w:rPr>
         <w:t xml:space="preserve"> Guide. </w:t>
       </w:r>
-      <w:r>
-        <w:rPr>
-          <w:rFonts w:eastAsia="Times New Roman"/>
-          <w:lang w:val="ru-RU"/>
-        </w:rPr>
-        <w:t xml:space="preserve">Руководство по упаковке </w:t>
-      </w:r>
-      <w:r>
-        <w:rPr>
-          <w:rFonts w:eastAsia="Times New Roman"/>
-        </w:rPr>
-        <w:t>Java</w:t>
-      </w:r>
-      <w:r>
-        <w:rPr>
-          <w:rFonts w:eastAsia="Times New Roman"/>
-          <w:lang w:val="ru-RU"/>
-        </w:rPr>
-        <w:t>-приложений.</w:t>
+      <w:proofErr w:type="spellStart"/>
+      <w:r>
+        <w:rPr>
+          <w:rFonts w:eastAsia="Times New Roman" w:cs="Times New Roman"/>
+          <w:szCs w:val="28"/>
+          <w:lang w:val="ru-RU" w:eastAsia="ru-RU"/>
+        </w:rPr>
+        <w:t>Release</w:t>
+      </w:r>
+      <w:proofErr w:type="spellEnd"/>
+      <w:r>
+        <w:rPr>
+          <w:rFonts w:eastAsia="Times New Roman" w:cs="Times New Roman"/>
+          <w:szCs w:val="28"/>
+          <w:lang w:val="ru-RU" w:eastAsia="ru-RU"/>
+        </w:rPr>
+        <w:t xml:space="preserve"> 17 [Электронный ресурс]. </w:t>
+      </w:r>
+      <w:r>
+        <w:rPr>
+          <w:rFonts w:eastAsia="Times New Roman" w:cs="Times New Roman"/>
+          <w:szCs w:val="28"/>
+          <w:lang w:val="ru-RU" w:eastAsia="ru-RU"/>
+        </w:rPr>
+        <w:t>-</w:t>
+      </w:r>
+      <w:r>
+        <w:rPr>
+          <w:rFonts w:eastAsia="Times New Roman" w:cs="Times New Roman"/>
+          <w:szCs w:val="28"/>
+          <w:lang w:val="ru-RU" w:eastAsia="ru-RU"/>
+        </w:rPr>
+        <w:t xml:space="preserve"> Oracle, 2025.</w:t>
       </w:r>
     </w:p>
     <w:p>
       <w:pPr>
-        <w:spacing w:after="0"/>
-        <w:rPr>
-          <w:lang w:val="ru-RU"/>
+        <w:pStyle w:val="a7"/>
+        <w:numPr>
+          <w:ilvl w:val="0"/>
+          <w:numId w:val="7"/>
+        </w:numPr>
+        <w:tabs>
+          <w:tab w:val="left" w:pos="993"/>
+        </w:tabs>
+        <w:ind w:left="0" w:firstLine="709"/>
+        <w:rPr>
+          <w:szCs w:val="28"/>
+          <w:lang w:val="ru-RU" w:eastAsia="ru-RU"/>
         </w:rPr>
       </w:pPr>
-      <w:r>
-        <w:rPr>
-          <w:rFonts w:eastAsia="Times New Roman"/>
-          <w:lang w:val="ru-RU"/>
-        </w:rPr>
-        <w:t xml:space="preserve">20. Проектная документация </w:t>
-      </w:r>
       <w:proofErr w:type="spellStart"/>
       <w:r>
         <w:rPr>
-          <w:rFonts w:eastAsia="Times New Roman"/>
-        </w:rPr>
-        <w:t>PfP</w:t>
+          <w:szCs w:val="28"/>
+          <w:lang w:val="ru-RU" w:eastAsia="ru-RU"/>
+        </w:rPr>
+        <w:t>Testcontainers</w:t>
       </w:r>
       <w:proofErr w:type="spellEnd"/>
       <w:r>
         <w:rPr>
-          <w:rFonts w:eastAsia="Times New Roman"/>
-          <w:lang w:val="ru-RU"/>
+          <w:szCs w:val="28"/>
+          <w:lang w:val="ru-RU" w:eastAsia="ru-RU"/>
         </w:rPr>
         <w:t xml:space="preserve"> </w:t>
       </w:r>
-      <w:r>
-        <w:rPr>
-          <w:rFonts w:eastAsia="Times New Roman"/>
-        </w:rPr>
-        <w:t>Companion</w:t>
-      </w:r>
-      <w:r>
-        <w:rPr>
-          <w:rFonts w:eastAsia="Times New Roman"/>
-          <w:lang w:val="ru-RU"/>
-        </w:rPr>
-        <w:t xml:space="preserve">: каталоги </w:t>
-      </w:r>
-      <w:r>
-        <w:rPr>
-          <w:rFonts w:eastAsia="Times New Roman"/>
-        </w:rPr>
-        <w:t>docs</w:t>
-      </w:r>
-      <w:r>
-        <w:rPr>
-          <w:rFonts w:eastAsia="Times New Roman"/>
-          <w:lang w:val="ru-RU"/>
-        </w:rPr>
-        <w:t xml:space="preserve">, </w:t>
-      </w:r>
-      <w:r>
-        <w:rPr>
-          <w:rFonts w:eastAsia="Times New Roman"/>
-        </w:rPr>
-        <w:t>contracts</w:t>
-      </w:r>
-      <w:r>
-        <w:rPr>
-          <w:rFonts w:eastAsia="Times New Roman"/>
-          <w:lang w:val="ru-RU"/>
-        </w:rPr>
-        <w:t xml:space="preserve"> и справочник </w:t>
-      </w:r>
       <w:proofErr w:type="spellStart"/>
       <w:r>
         <w:rPr>
-          <w:rFonts w:eastAsia="Times New Roman"/>
-        </w:rPr>
-        <w:t>pfp</w:t>
+          <w:szCs w:val="28"/>
+          <w:lang w:val="ru-RU" w:eastAsia="ru-RU"/>
+        </w:rPr>
+        <w:t>for</w:t>
       </w:r>
       <w:proofErr w:type="spellEnd"/>
       <w:r>
         <w:rPr>
-          <w:rFonts w:eastAsia="Times New Roman"/>
-          <w:lang w:val="ru-RU"/>
-        </w:rPr>
-        <w:t>_</w:t>
-      </w:r>
-      <w:r>
-        <w:rPr>
-          <w:rFonts w:eastAsia="Times New Roman"/>
-        </w:rPr>
-        <w:t>code</w:t>
-      </w:r>
-      <w:r>
-        <w:rPr>
-          <w:rFonts w:eastAsia="Times New Roman"/>
-          <w:lang w:val="ru-RU"/>
-        </w:rPr>
-        <w:t>_</w:t>
-      </w:r>
-      <w:r>
-        <w:rPr>
-          <w:rFonts w:eastAsia="Times New Roman"/>
-        </w:rPr>
-        <w:t>reference</w:t>
-      </w:r>
-      <w:r>
-        <w:rPr>
-          <w:rFonts w:eastAsia="Times New Roman"/>
-          <w:lang w:val="ru-RU"/>
-        </w:rPr>
-        <w:t>.</w:t>
-      </w:r>
-      <w:r>
-        <w:rPr>
-          <w:rFonts w:eastAsia="Times New Roman"/>
-        </w:rPr>
-        <w:t>md</w:t>
-      </w:r>
-      <w:r>
-        <w:rPr>
-          <w:rFonts w:eastAsia="Times New Roman"/>
-          <w:lang w:val="ru-RU"/>
-        </w:rPr>
-        <w:t>.</w:t>
+          <w:szCs w:val="28"/>
+          <w:lang w:val="ru-RU" w:eastAsia="ru-RU"/>
+        </w:rPr>
+        <w:t xml:space="preserve"> Java </w:t>
+      </w:r>
+      <w:proofErr w:type="spellStart"/>
+      <w:r>
+        <w:rPr>
+          <w:szCs w:val="28"/>
+          <w:lang w:val="ru-RU" w:eastAsia="ru-RU"/>
+        </w:rPr>
+        <w:t>Documentation</w:t>
+      </w:r>
+      <w:proofErr w:type="spellEnd"/>
+      <w:r>
+        <w:rPr>
+          <w:szCs w:val="28"/>
+          <w:lang w:val="ru-RU" w:eastAsia="ru-RU"/>
+        </w:rPr>
+        <w:t xml:space="preserve"> [Электронный ресурс]. </w:t>
+      </w:r>
+      <w:r>
+        <w:rPr>
+          <w:szCs w:val="28"/>
+          <w:lang w:val="ru-RU" w:eastAsia="ru-RU"/>
+        </w:rPr>
+        <w:t>-</w:t>
+      </w:r>
+      <w:r>
+        <w:rPr>
+          <w:szCs w:val="28"/>
+          <w:lang w:val="ru-RU" w:eastAsia="ru-RU"/>
+        </w:rPr>
+        <w:t xml:space="preserve"> Официальная документация библиотеки </w:t>
+      </w:r>
+      <w:proofErr w:type="spellStart"/>
+      <w:r>
+        <w:rPr>
+          <w:szCs w:val="28"/>
+          <w:lang w:val="ru-RU" w:eastAsia="ru-RU"/>
+        </w:rPr>
+        <w:t>Testcontainers</w:t>
+      </w:r>
+      <w:proofErr w:type="spellEnd"/>
+      <w:r>
+        <w:rPr>
+          <w:szCs w:val="28"/>
+          <w:lang w:val="ru-RU" w:eastAsia="ru-RU"/>
+        </w:rPr>
+        <w:t xml:space="preserve"> для интеграционного тестирования Java-приложений с использованием </w:t>
+      </w:r>
+      <w:proofErr w:type="spellStart"/>
+      <w:r>
+        <w:rPr>
+          <w:szCs w:val="28"/>
+          <w:lang w:val="ru-RU" w:eastAsia="ru-RU"/>
+        </w:rPr>
+        <w:t>контейнеризированных</w:t>
+      </w:r>
+      <w:proofErr w:type="spellEnd"/>
+      <w:r>
+        <w:rPr>
+          <w:szCs w:val="28"/>
+          <w:lang w:val="ru-RU" w:eastAsia="ru-RU"/>
+        </w:rPr>
+        <w:t xml:space="preserve"> зависимостей.</w:t>
       </w:r>
     </w:p>
     <w:p>
@@ -40511,7 +41432,6 @@
           <w:lang w:val="ru-RU"/>
         </w:rPr>
       </w:pPr>
-      <w:bookmarkStart w:id="41" w:name="_Toc233035891"/>
       <w:r>
         <w:rPr>
           <w:rFonts w:ascii="Times New Roman" w:eastAsia="Times New Roman" w:hAnsi="Times New Roman"/>
@@ -40537,16 +41457,133 @@
           <w:rFonts w:eastAsia="Times New Roman"/>
           <w:lang w:val="ru-RU"/>
         </w:rPr>
-        <w:t xml:space="preserve">В приложении перечислены скриншоты, подтверждающие реализацию основных пользовательских и административных сценариев. Изображения хранятся в репозитории </w:t>
+        <w:t>В приложении перечислены скриншоты, подтверждающие реализацию основных пользовательских и административных сценариев. Изображения хранятся в репозитории</w:t>
+      </w:r>
+      <w:r>
+        <w:rPr>
+          <w:rFonts w:eastAsia="Times New Roman"/>
+          <w:lang w:val="ru-RU"/>
+        </w:rPr>
+        <w:t xml:space="preserve">: </w:t>
       </w:r>
       <w:hyperlink r:id="rId7" w:history="1">
         <w:r>
           <w:rPr>
             <w:rStyle w:val="ac"/>
-            <w:rFonts w:eastAsia="Times New Roman"/>
+          </w:rPr>
+          <w:t>https</w:t>
+        </w:r>
+        <w:r>
+          <w:rPr>
+            <w:rStyle w:val="ac"/>
             <w:lang w:val="ru-RU"/>
           </w:rPr>
-          <w:t>https://github.com/ArAversi0/PfP-Alex-Pancheshny</w:t>
+          <w:t>://</w:t>
+        </w:r>
+        <w:proofErr w:type="spellStart"/>
+        <w:r>
+          <w:rPr>
+            <w:rStyle w:val="ac"/>
+          </w:rPr>
+          <w:t>github</w:t>
+        </w:r>
+        <w:proofErr w:type="spellEnd"/>
+        <w:r>
+          <w:rPr>
+            <w:rStyle w:val="ac"/>
+            <w:lang w:val="ru-RU"/>
+          </w:rPr>
+          <w:t>.</w:t>
+        </w:r>
+        <w:r>
+          <w:rPr>
+            <w:rStyle w:val="ac"/>
+          </w:rPr>
+          <w:t>com</w:t>
+        </w:r>
+        <w:r>
+          <w:rPr>
+            <w:rStyle w:val="ac"/>
+            <w:lang w:val="ru-RU"/>
+          </w:rPr>
+          <w:t>/</w:t>
+        </w:r>
+        <w:proofErr w:type="spellStart"/>
+        <w:r>
+          <w:rPr>
+            <w:rStyle w:val="ac"/>
+          </w:rPr>
+          <w:t>ArAversi</w:t>
+        </w:r>
+        <w:proofErr w:type="spellEnd"/>
+        <w:r>
+          <w:rPr>
+            <w:rStyle w:val="ac"/>
+            <w:lang w:val="ru-RU"/>
+          </w:rPr>
+          <w:t>0/</w:t>
+        </w:r>
+        <w:proofErr w:type="spellStart"/>
+        <w:r>
+          <w:rPr>
+            <w:rStyle w:val="ac"/>
+          </w:rPr>
+          <w:t>PfP</w:t>
+        </w:r>
+        <w:proofErr w:type="spellEnd"/>
+        <w:r>
+          <w:rPr>
+            <w:rStyle w:val="ac"/>
+            <w:lang w:val="ru-RU"/>
+          </w:rPr>
+          <w:t>_</w:t>
+        </w:r>
+        <w:r>
+          <w:rPr>
+            <w:rStyle w:val="ac"/>
+          </w:rPr>
+          <w:t>Alex</w:t>
+        </w:r>
+        <w:r>
+          <w:rPr>
+            <w:rStyle w:val="ac"/>
+            <w:lang w:val="ru-RU"/>
+          </w:rPr>
+          <w:t>_</w:t>
+        </w:r>
+        <w:proofErr w:type="spellStart"/>
+        <w:r>
+          <w:rPr>
+            <w:rStyle w:val="ac"/>
+          </w:rPr>
+          <w:t>Pancheshny</w:t>
+        </w:r>
+        <w:proofErr w:type="spellEnd"/>
+        <w:r>
+          <w:rPr>
+            <w:rStyle w:val="ac"/>
+            <w:lang w:val="ru-RU"/>
+          </w:rPr>
+          <w:t>/</w:t>
+        </w:r>
+        <w:r>
+          <w:rPr>
+            <w:rStyle w:val="ac"/>
+          </w:rPr>
+          <w:t>tree</w:t>
+        </w:r>
+        <w:r>
+          <w:rPr>
+            <w:rStyle w:val="ac"/>
+            <w:lang w:val="ru-RU"/>
+          </w:rPr>
+          <w:t>/</w:t>
+        </w:r>
+        <w:r>
+          <w:rPr>
+            <w:rStyle w:val="ac"/>
+          </w:rPr>
+          <w:t>main</w:t>
         </w:r>
       </w:hyperlink>
       <w:r>
@@ -40576,6 +41613,7 @@
       <w:r>
         <w:rPr>
           <w:rFonts w:eastAsia="Times New Roman"/>
+          <w:lang w:val="ru-RU"/>
         </w:rPr>
         <w:t>-</w:t>
       </w:r>
@@ -40639,6 +41677,7 @@
                 <w:b/>
                 <w:szCs w:val="28"/>
               </w:rPr>
+              <w:lastRenderedPageBreak/>
               <w:t>Номер</w:t>
             </w:r>
             <w:proofErr w:type="spellEnd"/>
@@ -41134,7 +42173,6 @@
                 <w:rFonts w:eastAsia="Times New Roman"/>
                 <w:szCs w:val="28"/>
               </w:rPr>
-              <w:lastRenderedPageBreak/>
               <w:t>А.5</w:t>
             </w:r>
           </w:p>
@@ -42305,6 +43343,7 @@
                 <w:rFonts w:eastAsia="Times New Roman"/>
                 <w:szCs w:val="28"/>
               </w:rPr>
+              <w:lastRenderedPageBreak/>
               <w:t>А.16</w:t>
             </w:r>
           </w:p>
@@ -42584,7 +43623,6 @@
                 <w:rFonts w:eastAsia="Times New Roman"/>
                 <w:szCs w:val="28"/>
               </w:rPr>
-              <w:lastRenderedPageBreak/>
               <w:t>А.19</w:t>
             </w:r>
           </w:p>
@@ -43255,6 +44293,7 @@
                 <w:rFonts w:eastAsia="Times New Roman"/>
                 <w:szCs w:val="28"/>
               </w:rPr>
+              <w:lastRenderedPageBreak/>
               <w:t>А.26</w:t>
             </w:r>
           </w:p>
@@ -43480,7 +44519,6 @@
           <w:color w:val="000000"/>
           <w:lang w:val="ru-RU"/>
         </w:rPr>
-        <w:lastRenderedPageBreak/>
         <w:t>Приложение Б.2.</w:t>
       </w:r>
       <w:r>
@@ -43750,6 +44788,119 @@
     </w:lvl>
   </w:abstractNum>
   <w:abstractNum w:abstractNumId="1" w15:restartNumberingAfterBreak="0">
+    <w:nsid w:val="2EAC49D4"/>
+    <w:multiLevelType w:val="multilevel"/>
+    <w:tmpl w:val="37E01EE0"/>
+    <w:lvl w:ilvl="0">
+      <w:start w:val="20"/>
+      <w:numFmt w:val="decimal"/>
+      <w:lvlText w:val="%1."/>
+      <w:lvlJc w:val="left"/>
+      <w:pPr>
+        <w:tabs>
+          <w:tab w:val="num" w:pos="720"/>
+        </w:tabs>
+        <w:ind w:left="720" w:hanging="360"/>
+      </w:pPr>
+    </w:lvl>
+    <w:lvl w:ilvl="1" w:tentative="1">
+      <w:start w:val="1"/>
+      <w:numFmt w:val="decimal"/>
+      <w:lvlText w:val="%2."/>
+      <w:lvlJc w:val="left"/>
+      <w:pPr>
+        <w:tabs>
+          <w:tab w:val="num" w:pos="1440"/>
+        </w:tabs>
+        <w:ind w:left="1440" w:hanging="360"/>
+      </w:pPr>
+    </w:lvl>
+    <w:lvl w:ilvl="2" w:tentative="1">
+      <w:start w:val="1"/>
+      <w:numFmt w:val="decimal"/>
+      <w:lvlText w:val="%3."/>
+      <w:lvlJc w:val="left"/>
+      <w:pPr>
+        <w:tabs>
+          <w:tab w:val="num" w:pos="2160"/>
+        </w:tabs>
+        <w:ind w:left="2160" w:hanging="360"/>
+      </w:pPr>
+    </w:lvl>
+    <w:lvl w:ilvl="3" w:tentative="1">
+      <w:start w:val="1"/>
+      <w:numFmt w:val="decimal"/>
+      <w:lvlText w:val="%4."/>
+      <w:lvlJc w:val="left"/>
+      <w:pPr>
+        <w:tabs>
+          <w:tab w:val="num" w:pos="2880"/>
+        </w:tabs>
+        <w:ind w:left="2880" w:hanging="360"/>
+      </w:pPr>
+    </w:lvl>
+    <w:lvl w:ilvl="4" w:tentative="1">
+      <w:start w:val="1"/>
+      <w:numFmt w:val="decimal"/>
+      <w:lvlText w:val="%5."/>
+      <w:lvlJc w:val="left"/>
+      <w:pPr>
+        <w:tabs>
+          <w:tab w:val="num" w:pos="3600"/>
+        </w:tabs>
+        <w:ind w:left="3600" w:hanging="360"/>
+      </w:pPr>
+    </w:lvl>
+    <w:lvl w:ilvl="5" w:tentative="1">
+      <w:start w:val="1"/>
+      <w:numFmt w:val="decimal"/>
+      <w:lvlText w:val="%6."/>
+      <w:lvlJc w:val="left"/>
+      <w:pPr>
+        <w:tabs>
+          <w:tab w:val="num" w:pos="4320"/>
+        </w:tabs>
+        <w:ind w:left="4320" w:hanging="360"/>
+      </w:pPr>
+    </w:lvl>
+    <w:lvl w:ilvl="6" w:tentative="1">
+      <w:start w:val="1"/>
+      <w:numFmt w:val="decimal"/>
+      <w:lvlText w:val="%7."/>
+      <w:lvlJc w:val="left"/>
+      <w:pPr>
+        <w:tabs>
+          <w:tab w:val="num" w:pos="5040"/>
+        </w:tabs>
+        <w:ind w:left="5040" w:hanging="360"/>
+      </w:pPr>
+    </w:lvl>
+    <w:lvl w:ilvl="7" w:tentative="1">
+      <w:start w:val="1"/>
+      <w:numFmt w:val="decimal"/>
+      <w:lvlText w:val="%8."/>
+      <w:lvlJc w:val="left"/>
+      <w:pPr>
+        <w:tabs>
+          <w:tab w:val="num" w:pos="5760"/>
+        </w:tabs>
+        <w:ind w:left="5760" w:hanging="360"/>
+      </w:pPr>
+    </w:lvl>
+    <w:lvl w:ilvl="8" w:tentative="1">
+      <w:start w:val="1"/>
+      <w:numFmt w:val="decimal"/>
+      <w:lvlText w:val="%9."/>
+      <w:lvlJc w:val="left"/>
+      <w:pPr>
+        <w:tabs>
+          <w:tab w:val="num" w:pos="6480"/>
+        </w:tabs>
+        <w:ind w:left="6480" w:hanging="360"/>
+      </w:pPr>
+    </w:lvl>
+  </w:abstractNum>
+  <w:abstractNum w:abstractNumId="2" w15:restartNumberingAfterBreak="0">
     <w:nsid w:val="3E8B1628"/>
     <w:multiLevelType w:val="hybridMultilevel"/>
     <w:tmpl w:val="4EB01F6C"/>
@@ -43803,7 +44954,93 @@
       <w:lvlJc w:val="left"/>
     </w:lvl>
   </w:abstractNum>
-  <w:abstractNum w:abstractNumId="2" w15:restartNumberingAfterBreak="0">
+  <w:abstractNum w:abstractNumId="3" w15:restartNumberingAfterBreak="0">
+    <w:nsid w:val="3FE50465"/>
+    <w:multiLevelType w:val="hybridMultilevel"/>
+    <w:tmpl w:val="8944578E"/>
+    <w:lvl w:ilvl="0" w:tplc="0419000F">
+      <w:start w:val="1"/>
+      <w:numFmt w:val="decimal"/>
+      <w:lvlText w:val="%1."/>
+      <w:lvlJc w:val="left"/>
+      <w:pPr>
+        <w:ind w:left="720" w:hanging="360"/>
+      </w:pPr>
+    </w:lvl>
+    <w:lvl w:ilvl="1" w:tplc="04190019" w:tentative="1">
+      <w:start w:val="1"/>
+      <w:numFmt w:val="lowerLetter"/>
+      <w:lvlText w:val="%2."/>
+      <w:lvlJc w:val="left"/>
+      <w:pPr>
+        <w:ind w:left="1440" w:hanging="360"/>
+      </w:pPr>
+    </w:lvl>
+    <w:lvl w:ilvl="2" w:tplc="0419001B" w:tentative="1">
+      <w:start w:val="1"/>
+      <w:numFmt w:val="lowerRoman"/>
+      <w:lvlText w:val="%3."/>
+      <w:lvlJc w:val="right"/>
+      <w:pPr>
+        <w:ind w:left="2160" w:hanging="180"/>
+      </w:pPr>
+    </w:lvl>
+    <w:lvl w:ilvl="3" w:tplc="0419000F" w:tentative="1">
+      <w:start w:val="1"/>
+      <w:numFmt w:val="decimal"/>
+      <w:lvlText w:val="%4."/>
+      <w:lvlJc w:val="left"/>
+      <w:pPr>
+        <w:ind w:left="2880" w:hanging="360"/>
+      </w:pPr>
+    </w:lvl>
+    <w:lvl w:ilvl="4" w:tplc="04190019" w:tentative="1">
+      <w:start w:val="1"/>
+      <w:numFmt w:val="lowerLetter"/>
+      <w:lvlText w:val="%5."/>
+      <w:lvlJc w:val="left"/>
+      <w:pPr>
+        <w:ind w:left="3600" w:hanging="360"/>
+      </w:pPr>
+    </w:lvl>
+    <w:lvl w:ilvl="5" w:tplc="0419001B" w:tentative="1">
+      <w:start w:val="1"/>
+      <w:numFmt w:val="lowerRoman"/>
+      <w:lvlText w:val="%6."/>
+      <w:lvlJc w:val="right"/>
+      <w:pPr>
+        <w:ind w:left="4320" w:hanging="180"/>
+      </w:pPr>
+    </w:lvl>
+    <w:lvl w:ilvl="6" w:tplc="0419000F" w:tentative="1">
+      <w:start w:val="1"/>
+      <w:numFmt w:val="decimal"/>
+      <w:lvlText w:val="%7."/>
+      <w:lvlJc w:val="left"/>
+      <w:pPr>
+        <w:ind w:left="5040" w:hanging="360"/>
+      </w:pPr>
+    </w:lvl>
+    <w:lvl w:ilvl="7" w:tplc="04190019" w:tentative="1">
+      <w:start w:val="1"/>
+      <w:numFmt w:val="lowerLetter"/>
+      <w:lvlText w:val="%8."/>
+      <w:lvlJc w:val="left"/>
+      <w:pPr>
+        <w:ind w:left="5760" w:hanging="360"/>
+      </w:pPr>
+    </w:lvl>
+    <w:lvl w:ilvl="8" w:tplc="0419001B" w:tentative="1">
+      <w:start w:val="1"/>
+      <w:numFmt w:val="lowerRoman"/>
+      <w:lvlText w:val="%9."/>
+      <w:lvlJc w:val="right"/>
+      <w:pPr>
+        <w:ind w:left="6480" w:hanging="180"/>
+      </w:pPr>
+    </w:lvl>
+  </w:abstractNum>
+  <w:abstractNum w:abstractNumId="4" w15:restartNumberingAfterBreak="0">
     <w:nsid w:val="4A7B2108"/>
     <w:multiLevelType w:val="hybridMultilevel"/>
     <w:tmpl w:val="C2501756"/>
@@ -43857,7 +45094,7 @@
       <w:lvlJc w:val="left"/>
     </w:lvl>
   </w:abstractNum>
-  <w:abstractNum w:abstractNumId="3" w15:restartNumberingAfterBreak="0">
+  <w:abstractNum w:abstractNumId="5" w15:restartNumberingAfterBreak="0">
     <w:nsid w:val="6730571D"/>
     <w:multiLevelType w:val="hybridMultilevel"/>
     <w:tmpl w:val="97B20688"/>
@@ -43943,7 +45180,7 @@
       </w:pPr>
     </w:lvl>
   </w:abstractNum>
-  <w:abstractNum w:abstractNumId="4" w15:restartNumberingAfterBreak="0">
+  <w:abstractNum w:abstractNumId="6" w15:restartNumberingAfterBreak="0">
     <w:nsid w:val="7B194828"/>
     <w:multiLevelType w:val="hybridMultilevel"/>
     <w:tmpl w:val="DA5819FC"/>
@@ -43998,19 +45235,19 @@
     </w:lvl>
   </w:abstractNum>
   <w:num w:numId="1" w16cid:durableId="1474446267">
-    <w:abstractNumId w:val="2"/>
+    <w:abstractNumId w:val="4"/>
     <w:lvlOverride w:ilvl="0">
       <w:startOverride w:val="1"/>
     </w:lvlOverride>
   </w:num>
   <w:num w:numId="2" w16cid:durableId="242301106">
-    <w:abstractNumId w:val="4"/>
+    <w:abstractNumId w:val="6"/>
     <w:lvlOverride w:ilvl="0">
       <w:startOverride w:val="1"/>
     </w:lvlOverride>
   </w:num>
   <w:num w:numId="3" w16cid:durableId="1555660365">
-    <w:abstractNumId w:val="1"/>
+    <w:abstractNumId w:val="2"/>
     <w:lvlOverride w:ilvl="0">
       <w:startOverride w:val="1"/>
     </w:lvlOverride>
@@ -44022,6 +45259,12 @@
     </w:lvlOverride>
   </w:num>
   <w:num w:numId="5" w16cid:durableId="121114400">
+    <w:abstractNumId w:val="5"/>
+  </w:num>
+  <w:num w:numId="6" w16cid:durableId="1682395751">
+    <w:abstractNumId w:val="1"/>
+  </w:num>
+  <w:num w:numId="7" w16cid:durableId="3211735">
     <w:abstractNumId w:val="3"/>
   </w:num>
 </w:numbering>
@@ -44642,7 +45885,6 @@
   <w:style w:type="character" w:default="1" w:styleId="a0">
     <w:name w:val="Default Paragraph Font"/>
     <w:uiPriority w:val="1"/>
-    <w:semiHidden/>
     <w:unhideWhenUsed/>
   </w:style>
   <w:style w:type="table" w:default="1" w:styleId="a1">

</xml_diff>

<commit_message>
Add 2 docker files
</commit_message>
<xml_diff>
--- a/docs/08-final/poyasnitelnaya_zapiska.docx
+++ b/docs/08-final/poyasnitelnaya_zapiska.docx
@@ -34566,6 +34566,12 @@
           <w:lang w:val="ru-RU"/>
         </w:rPr>
         <w:t xml:space="preserve"> завершались оба клиента. Такой порядок уменьшает риск многократной переделки интерфейсов из-за ещё не определённых бизнес-правил.</w:t>
+      </w:r>
+    </w:p>
+    <w:p>
+      <w:pPr/>
+      <w:r>
+        <w:t>Дополнительно к календарному плану подготовлена диаграмма Ганта в формате PNG: docs/08-final/images/gantt_diagram.png.</w:t>
       </w:r>
     </w:p>
     <w:p>

</xml_diff>